<commit_message>
Add README, report with screenshots, and edit feature
- README.md with feature list, tech stack, screenshots
- Updated course design report with tables, code, 7 screenshots
- Added edit functionality to TodoDetailActivity (menu/toolbar)
- Updated activity_detail layout with Toolbar
</commit_message>
<xml_diff>
--- a/report/202325040118_连佳炜_简易待办课程设计报告.docx
+++ b/report/202325040118_连佳炜_简易待办课程设计报告.docx
@@ -2,6 +2,9 @@
 <file path=word/document.xml><?xml version="1.0" encoding="utf-8"?>
 <w:document xmlns:wpc="http://schemas.microsoft.com/office/word/2010/wordprocessingCanvas" xmlns:mo="http://schemas.microsoft.com/office/mac/office/2008/main" xmlns:mc="http://schemas.openxmlformats.org/markup-compatibility/2006" xmlns:mv="urn:schemas-microsoft-com:mac:vml" xmlns:o="urn:schemas-microsoft-com:office:office" xmlns:r="http://schemas.openxmlformats.org/officeDocument/2006/relationships" xmlns:m="http://schemas.openxmlformats.org/officeDocument/2006/math" xmlns:v="urn:schemas-microsoft-com:vml" xmlns:wp14="http://schemas.microsoft.com/office/word/2010/wordprocessingDrawing" xmlns:wp="http://schemas.openxmlformats.org/drawingml/2006/wordprocessingDrawing" xmlns:w10="urn:schemas-microsoft-com:office:word" xmlns:w="http://schemas.openxmlformats.org/wordprocessingml/2006/main" xmlns:w14="http://schemas.microsoft.com/office/word/2010/wordml" xmlns:wpg="http://schemas.microsoft.com/office/word/2010/wordprocessingGroup" xmlns:wpi="http://schemas.microsoft.com/office/word/2010/wordprocessingInk" xmlns:wne="http://schemas.microsoft.com/office/word/2006/wordml" xmlns:wps="http://schemas.microsoft.com/office/word/2010/wordprocessingShape" mc:Ignorable="w14 wp14">
   <w:body>
+    <w:p/>
+    <w:p/>
+    <w:p/>
     <w:p/>
     <w:p/>
     <w:p/>
@@ -11,7 +14,6 @@
       </w:pPr>
       <w:r>
         <w:rPr>
-          <w:rFonts w:ascii="宋体" w:hAnsi="宋体" w:eastAsia="宋体"/>
           <w:b/>
           <w:sz w:val="44"/>
         </w:rPr>
@@ -24,34 +26,10 @@
       </w:pPr>
       <w:r>
         <w:rPr>
-          <w:rFonts w:ascii="宋体" w:hAnsi="宋体" w:eastAsia="宋体"/>
           <w:b/>
           <w:sz w:val="36"/>
         </w:rPr>
-        <w:t>移动应用开发（Android）课程设计报告</w:t>
-      </w:r>
-    </w:p>
-    <w:p/>
-    <w:p/>
-    <w:p/>
-    <w:p>
-      <w:pPr>
-        <w:jc w:val="center"/>
-      </w:pPr>
-      <w:r>
-        <w:rPr>
-          <w:rFonts w:ascii="宋体" w:hAnsi="宋体" w:eastAsia="宋体"/>
-          <w:b/>
-          <w:sz w:val="28"/>
-        </w:rPr>
-        <w:t>学　　号：</w:t>
-      </w:r>
-      <w:r>
-        <w:rPr>
-          <w:rFonts w:ascii="宋体" w:hAnsi="宋体" w:eastAsia="宋体"/>
-          <w:sz w:val="28"/>
-        </w:rPr>
-        <w:t>202325040118</w:t>
+        <w:t>移动应用开发（Android）</w:t>
       </w:r>
     </w:p>
     <w:p>
@@ -60,18 +38,22 @@
       </w:pPr>
       <w:r>
         <w:rPr>
-          <w:rFonts w:ascii="宋体" w:hAnsi="宋体" w:eastAsia="宋体"/>
           <w:b/>
+          <w:sz w:val="36"/>
+        </w:rPr>
+        <w:t>课程设计报告</w:t>
+      </w:r>
+    </w:p>
+    <w:p/>
+    <w:p>
+      <w:pPr>
+        <w:jc w:val="center"/>
+      </w:pPr>
+      <w:r>
+        <w:rPr>
           <w:sz w:val="28"/>
         </w:rPr>
-        <w:t>姓　　名：</w:t>
-      </w:r>
-      <w:r>
-        <w:rPr>
-          <w:rFonts w:ascii="宋体" w:hAnsi="宋体" w:eastAsia="宋体"/>
-          <w:sz w:val="28"/>
-        </w:rPr>
-        <w:t>连佳炜</w:t>
+        <w:t>题目：基于安卓的简易待办应用开发</w:t>
       </w:r>
     </w:p>
     <w:p>
@@ -80,18 +62,9 @@
       </w:pPr>
       <w:r>
         <w:rPr>
-          <w:rFonts w:ascii="宋体" w:hAnsi="宋体" w:eastAsia="宋体"/>
-          <w:b/>
           <w:sz w:val="28"/>
         </w:rPr>
-        <w:t>专业班级：</w:t>
-      </w:r>
-      <w:r>
-        <w:rPr>
-          <w:rFonts w:ascii="宋体" w:hAnsi="宋体" w:eastAsia="宋体"/>
-          <w:sz w:val="28"/>
-        </w:rPr>
-        <w:t>计算机科学与技术</w:t>
+        <w:t>学号：202325040118</w:t>
       </w:r>
     </w:p>
     <w:p>
@@ -100,18 +73,9 @@
       </w:pPr>
       <w:r>
         <w:rPr>
-          <w:rFonts w:ascii="宋体" w:hAnsi="宋体" w:eastAsia="宋体"/>
-          <w:b/>
           <w:sz w:val="28"/>
         </w:rPr>
-        <w:t>二级学院：</w:t>
-      </w:r>
-      <w:r>
-        <w:rPr>
-          <w:rFonts w:ascii="宋体" w:hAnsi="宋体" w:eastAsia="宋体"/>
-          <w:sz w:val="28"/>
-        </w:rPr>
-        <w:t>信息工程学院</w:t>
+        <w:t>姓名：连佳炊</w:t>
       </w:r>
     </w:p>
     <w:p>
@@ -120,18 +84,20 @@
       </w:pPr>
       <w:r>
         <w:rPr>
-          <w:rFonts w:ascii="宋体" w:hAnsi="宋体" w:eastAsia="宋体"/>
-          <w:b/>
           <w:sz w:val="28"/>
         </w:rPr>
-        <w:t>题　　目：</w:t>
+        <w:t>专业班级：计算机科学与技术</w:t>
       </w:r>
+    </w:p>
+    <w:p>
+      <w:pPr>
+        <w:jc w:val="center"/>
+      </w:pPr>
       <w:r>
         <w:rPr>
-          <w:rFonts w:ascii="宋体" w:hAnsi="宋体" w:eastAsia="宋体"/>
           <w:sz w:val="28"/>
         </w:rPr>
-        <w:t>基于安卓的简易待办应用开发</w:t>
+        <w:t>二级学院：信息工程学院</w:t>
       </w:r>
     </w:p>
     <w:p>
@@ -145,21 +111,14 @@
       </w:pPr>
       <w:r>
         <w:rPr>
-          <w:rFonts w:ascii="黑体" w:hAnsi="黑体" w:eastAsia="黑体"/>
+          <w:color w:val="000000"/>
         </w:rPr>
-        <w:t>一、项目背景</w:t>
+        <w:t>1. 项目背景</w:t>
       </w:r>
     </w:p>
     <w:p>
-      <w:pPr>
-        <w:ind w:firstLine="420"/>
-      </w:pPr>
       <w:r>
-        <w:rPr>
-          <w:rFonts w:ascii="宋体" w:hAnsi="宋体" w:eastAsia="宋体"/>
-          <w:sz w:val="24"/>
-        </w:rPr>
-        <w:t>移动互联网时代，人们需要记录日常任务和待办事项。本次课程设计基于 Android 平台开发一个简易待办应用，满足用户创建、查看、编辑、删除待办的需求，并提供状态管理功能。</w:t>
+        <w:t>随着移动互联网的快速发展，人们在快节奏的学习和工作中常常需要记录各种待办事项。本次课程设计基于 Android 平台开发一个简易待办应用，满足用户对日常任务管理的核心需求。</w:t>
       </w:r>
     </w:p>
     <w:p>
@@ -168,129 +127,344 @@
       </w:pPr>
       <w:r>
         <w:rPr>
-          <w:rFonts w:ascii="黑体" w:hAnsi="黑体" w:eastAsia="黑体"/>
+          <w:color w:val="000000"/>
         </w:rPr>
-        <w:t>二、功能需求分析</w:t>
+        <w:t>2. 功能需求分析</w:t>
+      </w:r>
+    </w:p>
+    <w:p>
+      <w:r>
+        <w:t>本应用包含以下五个核心功能：</w:t>
+      </w:r>
+    </w:p>
+    <w:tbl>
+      <w:tblPr>
+        <w:tblStyle w:val="TableGrid"/>
+        <w:tblW w:type="auto" w:w="0"/>
+        <w:jc w:val="center"/>
+        <w:tblLook w:firstColumn="1" w:firstRow="1" w:lastColumn="0" w:lastRow="0" w:noHBand="0" w:noVBand="1" w:val="04A0"/>
+      </w:tblPr>
+      <w:tblGrid>
+        <w:gridCol w:w="2161"/>
+        <w:gridCol w:w="2161"/>
+        <w:gridCol w:w="2161"/>
+        <w:gridCol w:w="2161"/>
+      </w:tblGrid>
+      <w:tr>
+        <w:tc>
+          <w:tcPr>
+            <w:tcW w:type="dxa" w:w="2161"/>
+          </w:tcPr>
+          <w:p>
+            <w:r>
+              <w:rPr>
+                <w:b/>
+              </w:rPr>
+              <w:t>序号</w:t>
+            </w:r>
+          </w:p>
+        </w:tc>
+        <w:tc>
+          <w:tcPr>
+            <w:tcW w:type="dxa" w:w="2161"/>
+          </w:tcPr>
+          <w:p>
+            <w:r>
+              <w:rPr>
+                <w:b/>
+              </w:rPr>
+              <w:t>功能模块</w:t>
+            </w:r>
+          </w:p>
+        </w:tc>
+        <w:tc>
+          <w:tcPr>
+            <w:tcW w:type="dxa" w:w="2161"/>
+          </w:tcPr>
+          <w:p>
+            <w:r>
+              <w:rPr>
+                <w:b/>
+              </w:rPr>
+              <w:t>功能描述</w:t>
+            </w:r>
+          </w:p>
+        </w:tc>
+        <w:tc>
+          <w:tcPr>
+            <w:tcW w:type="dxa" w:w="2161"/>
+          </w:tcPr>
+          <w:p>
+            <w:r>
+              <w:rPr>
+                <w:b/>
+              </w:rPr>
+              <w:t>优先级</w:t>
+            </w:r>
+          </w:p>
+        </w:tc>
+      </w:tr>
+      <w:tr>
+        <w:tc>
+          <w:tcPr>
+            <w:tcW w:type="dxa" w:w="2161"/>
+          </w:tcPr>
+          <w:p>
+            <w:r>
+              <w:t>1</w:t>
+            </w:r>
+          </w:p>
+        </w:tc>
+        <w:tc>
+          <w:tcPr>
+            <w:tcW w:type="dxa" w:w="2161"/>
+          </w:tcPr>
+          <w:p>
+            <w:r>
+              <w:t>待办创建</w:t>
+            </w:r>
+          </w:p>
+        </w:tc>
+        <w:tc>
+          <w:tcPr>
+            <w:tcW w:type="dxa" w:w="2161"/>
+          </w:tcPr>
+          <w:p>
+            <w:r>
+              <w:t>用户输入标题和内容，创建新的待办事项</w:t>
+            </w:r>
+          </w:p>
+        </w:tc>
+        <w:tc>
+          <w:tcPr>
+            <w:tcW w:type="dxa" w:w="2161"/>
+          </w:tcPr>
+          <w:p>
+            <w:r>
+              <w:t>高</w:t>
+            </w:r>
+          </w:p>
+        </w:tc>
+      </w:tr>
+      <w:tr>
+        <w:tc>
+          <w:tcPr>
+            <w:tcW w:type="dxa" w:w="2161"/>
+          </w:tcPr>
+          <w:p>
+            <w:r>
+              <w:t>2</w:t>
+            </w:r>
+          </w:p>
+        </w:tc>
+        <w:tc>
+          <w:tcPr>
+            <w:tcW w:type="dxa" w:w="2161"/>
+          </w:tcPr>
+          <w:p>
+            <w:r>
+              <w:t>待办查看</w:t>
+            </w:r>
+          </w:p>
+        </w:tc>
+        <w:tc>
+          <w:tcPr>
+            <w:tcW w:type="dxa" w:w="2161"/>
+          </w:tcPr>
+          <w:p>
+            <w:r>
+              <w:t>列表展示所有待办，点击可查看详细内容</w:t>
+            </w:r>
+          </w:p>
+        </w:tc>
+        <w:tc>
+          <w:tcPr>
+            <w:tcW w:type="dxa" w:w="2161"/>
+          </w:tcPr>
+          <w:p>
+            <w:r>
+              <w:t>高</w:t>
+            </w:r>
+          </w:p>
+        </w:tc>
+      </w:tr>
+      <w:tr>
+        <w:tc>
+          <w:tcPr>
+            <w:tcW w:type="dxa" w:w="2161"/>
+          </w:tcPr>
+          <w:p>
+            <w:r>
+              <w:t>3</w:t>
+            </w:r>
+          </w:p>
+        </w:tc>
+        <w:tc>
+          <w:tcPr>
+            <w:tcW w:type="dxa" w:w="2161"/>
+          </w:tcPr>
+          <w:p>
+            <w:r>
+              <w:t>待办编辑</w:t>
+            </w:r>
+          </w:p>
+        </w:tc>
+        <w:tc>
+          <w:tcPr>
+            <w:tcW w:type="dxa" w:w="2161"/>
+          </w:tcPr>
+          <w:p>
+            <w:r>
+              <w:t>在详情页修改待办内容</w:t>
+            </w:r>
+          </w:p>
+        </w:tc>
+        <w:tc>
+          <w:tcPr>
+            <w:tcW w:type="dxa" w:w="2161"/>
+          </w:tcPr>
+          <w:p>
+            <w:r>
+              <w:t>高</w:t>
+            </w:r>
+          </w:p>
+        </w:tc>
+      </w:tr>
+      <w:tr>
+        <w:tc>
+          <w:tcPr>
+            <w:tcW w:type="dxa" w:w="2161"/>
+          </w:tcPr>
+          <w:p>
+            <w:r>
+              <w:t>4</w:t>
+            </w:r>
+          </w:p>
+        </w:tc>
+        <w:tc>
+          <w:tcPr>
+            <w:tcW w:type="dxa" w:w="2161"/>
+          </w:tcPr>
+          <w:p>
+            <w:r>
+              <w:t>待办删除</w:t>
+            </w:r>
+          </w:p>
+        </w:tc>
+        <w:tc>
+          <w:tcPr>
+            <w:tcW w:type="dxa" w:w="2161"/>
+          </w:tcPr>
+          <w:p>
+            <w:r>
+              <w:t>确认弹窗后删除不需要的待办</w:t>
+            </w:r>
+          </w:p>
+        </w:tc>
+        <w:tc>
+          <w:tcPr>
+            <w:tcW w:type="dxa" w:w="2161"/>
+          </w:tcPr>
+          <w:p>
+            <w:r>
+              <w:t>高</w:t>
+            </w:r>
+          </w:p>
+        </w:tc>
+      </w:tr>
+      <w:tr>
+        <w:tc>
+          <w:tcPr>
+            <w:tcW w:type="dxa" w:w="2161"/>
+          </w:tcPr>
+          <w:p>
+            <w:r>
+              <w:t>5</w:t>
+            </w:r>
+          </w:p>
+        </w:tc>
+        <w:tc>
+          <w:tcPr>
+            <w:tcW w:type="dxa" w:w="2161"/>
+          </w:tcPr>
+          <w:p>
+            <w:r>
+              <w:t>状态切换</w:t>
+            </w:r>
+          </w:p>
+        </w:tc>
+        <w:tc>
+          <w:tcPr>
+            <w:tcW w:type="dxa" w:w="2161"/>
+          </w:tcPr>
+          <w:p>
+            <w:r>
+              <w:t>标记待办为已完成/未完成</w:t>
+            </w:r>
+          </w:p>
+        </w:tc>
+        <w:tc>
+          <w:tcPr>
+            <w:tcW w:type="dxa" w:w="2161"/>
+          </w:tcPr>
+          <w:p>
+            <w:r>
+              <w:t>中</w:t>
+            </w:r>
+          </w:p>
+        </w:tc>
+      </w:tr>
+    </w:tbl>
+    <w:p/>
+    <w:p>
+      <w:pPr>
+        <w:jc w:val="center"/>
+      </w:pPr>
+      <w:r>
+        <w:drawing>
+          <wp:inline xmlns:a="http://schemas.openxmlformats.org/drawingml/2006/main" xmlns:pic="http://schemas.openxmlformats.org/drawingml/2006/picture">
+            <wp:extent cx="3200400" cy="6934200"/>
+            <wp:docPr id="1" name="Picture 1"/>
+            <wp:cNvGraphicFramePr>
+              <a:graphicFrameLocks noChangeAspect="1"/>
+            </wp:cNvGraphicFramePr>
+            <a:graphic>
+              <a:graphicData uri="http://schemas.openxmlformats.org/drawingml/2006/picture">
+                <pic:pic>
+                  <pic:nvPicPr>
+                    <pic:cNvPr id="0" name="01_empty_state.png"/>
+                    <pic:cNvPicPr/>
+                  </pic:nvPicPr>
+                  <pic:blipFill>
+                    <a:blip r:embed="rId9"/>
+                    <a:stretch>
+                      <a:fillRect/>
+                    </a:stretch>
+                  </pic:blipFill>
+                  <pic:spPr>
+                    <a:xfrm>
+                      <a:off x="0" y="0"/>
+                      <a:ext cx="3200400" cy="6934200"/>
+                    </a:xfrm>
+                    <a:prstGeom prst="rect"/>
+                  </pic:spPr>
+                </pic:pic>
+              </a:graphicData>
+            </a:graphic>
+          </wp:inline>
+        </w:drawing>
       </w:r>
     </w:p>
     <w:p>
       <w:pPr>
-        <w:ind w:firstLine="420"/>
+        <w:jc w:val="center"/>
       </w:pPr>
       <w:r>
         <w:rPr>
-          <w:rFonts w:ascii="宋体" w:hAnsi="宋体" w:eastAsia="宋体"/>
-          <w:b/>
-          <w:sz w:val="24"/>
+          <w:i/>
+          <w:sz w:val="20"/>
         </w:rPr>
-        <w:t>待办创建：</w:t>
-      </w:r>
-      <w:r>
-        <w:rPr>
-          <w:rFonts w:ascii="宋体" w:hAnsi="宋体" w:eastAsia="宋体"/>
-          <w:sz w:val="24"/>
-        </w:rPr>
-        <w:t>用户输入标题和内容创建待办</w:t>
-      </w:r>
-    </w:p>
-    <w:p>
-      <w:pPr>
-        <w:ind w:firstLine="420"/>
-      </w:pPr>
-      <w:r>
-        <w:rPr>
-          <w:rFonts w:ascii="宋体" w:hAnsi="宋体" w:eastAsia="宋体"/>
-          <w:b/>
-          <w:sz w:val="24"/>
-        </w:rPr>
-        <w:t>待办查看：</w:t>
-      </w:r>
-      <w:r>
-        <w:rPr>
-          <w:rFonts w:ascii="宋体" w:hAnsi="宋体" w:eastAsia="宋体"/>
-          <w:sz w:val="24"/>
-        </w:rPr>
-        <w:t>列表展示所有待办，支持点击查看详情</w:t>
-      </w:r>
-    </w:p>
-    <w:p>
-      <w:pPr>
-        <w:ind w:firstLine="420"/>
-      </w:pPr>
-      <w:r>
-        <w:rPr>
-          <w:rFonts w:ascii="宋体" w:hAnsi="宋体" w:eastAsia="宋体"/>
-          <w:b/>
-          <w:sz w:val="24"/>
-        </w:rPr>
-        <w:t>待办编辑：</w:t>
-      </w:r>
-      <w:r>
-        <w:rPr>
-          <w:rFonts w:ascii="宋体" w:hAnsi="宋体" w:eastAsia="宋体"/>
-          <w:sz w:val="24"/>
-        </w:rPr>
-        <w:t>在详情页可修改内容</w:t>
-      </w:r>
-    </w:p>
-    <w:p>
-      <w:pPr>
-        <w:ind w:firstLine="420"/>
-      </w:pPr>
-      <w:r>
-        <w:rPr>
-          <w:rFonts w:ascii="宋体" w:hAnsi="宋体" w:eastAsia="宋体"/>
-          <w:b/>
-          <w:sz w:val="24"/>
-        </w:rPr>
-        <w:t>待办删除：</w:t>
-      </w:r>
-      <w:r>
-        <w:rPr>
-          <w:rFonts w:ascii="宋体" w:hAnsi="宋体" w:eastAsia="宋体"/>
-          <w:sz w:val="24"/>
-        </w:rPr>
-        <w:t>确认后删除待办</w:t>
-      </w:r>
-    </w:p>
-    <w:p>
-      <w:pPr>
-        <w:ind w:firstLine="420"/>
-      </w:pPr>
-      <w:r>
-        <w:rPr>
-          <w:rFonts w:ascii="宋体" w:hAnsi="宋体" w:eastAsia="宋体"/>
-          <w:b/>
-          <w:sz w:val="24"/>
-        </w:rPr>
-        <w:t>待办状态：</w:t>
-      </w:r>
-      <w:r>
-        <w:rPr>
-          <w:rFonts w:ascii="宋体" w:hAnsi="宋体" w:eastAsia="宋体"/>
-          <w:sz w:val="24"/>
-        </w:rPr>
-        <w:t>可切换已完成/未完成状态</w:t>
-      </w:r>
-    </w:p>
-    <w:p>
-      <w:pPr>
-        <w:ind w:firstLine="420"/>
-      </w:pPr>
-      <w:r>
-        <w:rPr>
-          <w:rFonts w:ascii="宋体" w:hAnsi="宋体" w:eastAsia="宋体"/>
-          <w:b/>
-          <w:sz w:val="24"/>
-        </w:rPr>
-        <w:t>界面要求：</w:t>
-      </w:r>
-      <w:r>
-        <w:rPr>
-          <w:rFonts w:ascii="宋体" w:hAnsi="宋体" w:eastAsia="宋体"/>
-          <w:sz w:val="24"/>
-        </w:rPr>
-        <w:t>简洁直观，Material Design 风格</w:t>
+        <w:t>图：应用启动空状态界面</w:t>
       </w:r>
     </w:p>
     <w:p>
@@ -299,117 +473,1103 @@
       </w:pPr>
       <w:r>
         <w:rPr>
-          <w:rFonts w:ascii="黑体" w:hAnsi="黑体" w:eastAsia="黑体"/>
+          <w:color w:val="000000"/>
         </w:rPr>
-        <w:t>三、设计思路</w:t>
+        <w:t>3. 设计思路</w:t>
       </w:r>
     </w:p>
     <w:p>
       <w:pPr>
-        <w:ind w:firstLine="420"/>
+        <w:pStyle w:val="Heading2"/>
       </w:pPr>
       <w:r>
         <w:rPr>
-          <w:rFonts w:ascii="宋体" w:hAnsi="宋体" w:eastAsia="宋体"/>
-          <w:sz w:val="24"/>
+          <w:color w:val="000000"/>
         </w:rPr>
-        <w:t>技术栈：Java + SQLite + RecyclerView + Material Components</w:t>
+        <w:t>3.1 技术选型</w:t>
+      </w:r>
+    </w:p>
+    <w:tbl>
+      <w:tblPr>
+        <w:tblStyle w:val="TableGrid"/>
+        <w:tblW w:type="auto" w:w="0"/>
+        <w:tblLook w:firstColumn="1" w:firstRow="1" w:lastColumn="0" w:lastRow="0" w:noHBand="0" w:noVBand="1" w:val="04A0"/>
+      </w:tblPr>
+      <w:tblGrid>
+        <w:gridCol w:w="4323"/>
+        <w:gridCol w:w="4323"/>
+      </w:tblGrid>
+      <w:tr>
+        <w:tc>
+          <w:tcPr>
+            <w:tcW w:type="dxa" w:w="4323"/>
+          </w:tcPr>
+          <w:p>
+            <w:r>
+              <w:rPr>
+                <w:b/>
+              </w:rPr>
+              <w:t>技术方向</w:t>
+            </w:r>
+          </w:p>
+        </w:tc>
+        <w:tc>
+          <w:tcPr>
+            <w:tcW w:type="dxa" w:w="4323"/>
+          </w:tcPr>
+          <w:p>
+            <w:r>
+              <w:rPr>
+                <w:b/>
+              </w:rPr>
+              <w:t>选型结果</w:t>
+            </w:r>
+          </w:p>
+        </w:tc>
+      </w:tr>
+      <w:tr>
+        <w:tc>
+          <w:tcPr>
+            <w:tcW w:type="dxa" w:w="4323"/>
+          </w:tcPr>
+          <w:p>
+            <w:r>
+              <w:t>编程语言</w:t>
+            </w:r>
+          </w:p>
+        </w:tc>
+        <w:tc>
+          <w:tcPr>
+            <w:tcW w:type="dxa" w:w="4323"/>
+          </w:tcPr>
+          <w:p>
+            <w:r>
+              <w:t>Java（课程要求）</w:t>
+            </w:r>
+          </w:p>
+        </w:tc>
+      </w:tr>
+      <w:tr>
+        <w:tc>
+          <w:tcPr>
+            <w:tcW w:type="dxa" w:w="4323"/>
+          </w:tcPr>
+          <w:p>
+            <w:r>
+              <w:t>数据库</w:t>
+            </w:r>
+          </w:p>
+        </w:tc>
+        <w:tc>
+          <w:tcPr>
+            <w:tcW w:type="dxa" w:w="4323"/>
+          </w:tcPr>
+          <w:p>
+            <w:r>
+              <w:t>SQLite（本地轻量级存储）</w:t>
+            </w:r>
+          </w:p>
+        </w:tc>
+      </w:tr>
+      <w:tr>
+        <w:tc>
+          <w:tcPr>
+            <w:tcW w:type="dxa" w:w="4323"/>
+          </w:tcPr>
+          <w:p>
+            <w:r>
+              <w:t>UI框架</w:t>
+            </w:r>
+          </w:p>
+        </w:tc>
+        <w:tc>
+          <w:tcPr>
+            <w:tcW w:type="dxa" w:w="4323"/>
+          </w:tcPr>
+          <w:p>
+            <w:r>
+              <w:t>Material Components + ConstraintLayout</w:t>
+            </w:r>
+          </w:p>
+        </w:tc>
+      </w:tr>
+      <w:tr>
+        <w:tc>
+          <w:tcPr>
+            <w:tcW w:type="dxa" w:w="4323"/>
+          </w:tcPr>
+          <w:p>
+            <w:r>
+              <w:t>列表展示</w:t>
+            </w:r>
+          </w:p>
+        </w:tc>
+        <w:tc>
+          <w:tcPr>
+            <w:tcW w:type="dxa" w:w="4323"/>
+          </w:tcPr>
+          <w:p>
+            <w:r>
+              <w:t>RecyclerView + CardView</w:t>
+            </w:r>
+          </w:p>
+        </w:tc>
+      </w:tr>
+      <w:tr>
+        <w:tc>
+          <w:tcPr>
+            <w:tcW w:type="dxa" w:w="4323"/>
+          </w:tcPr>
+          <w:p>
+            <w:r>
+              <w:t>构建工具</w:t>
+            </w:r>
+          </w:p>
+        </w:tc>
+        <w:tc>
+          <w:tcPr>
+            <w:tcW w:type="dxa" w:w="4323"/>
+          </w:tcPr>
+          <w:p>
+            <w:r>
+              <w:t>Gradle 8.9 + AGP 8.7.3</w:t>
+            </w:r>
+          </w:p>
+        </w:tc>
+      </w:tr>
+    </w:tbl>
+    <w:p>
+      <w:pPr>
+        <w:pStyle w:val="Heading2"/>
+      </w:pPr>
+      <w:r>
+        <w:rPr>
+          <w:color w:val="000000"/>
+        </w:rPr>
+        <w:t>3.2 数据库设计</w:t>
+      </w:r>
+    </w:p>
+    <w:tbl>
+      <w:tblPr>
+        <w:tblStyle w:val="TableGrid"/>
+        <w:tblW w:type="auto" w:w="0"/>
+        <w:tblLook w:firstColumn="1" w:firstRow="1" w:lastColumn="0" w:lastRow="0" w:noHBand="0" w:noVBand="1" w:val="04A0"/>
+      </w:tblPr>
+      <w:tblGrid>
+        <w:gridCol w:w="2161"/>
+        <w:gridCol w:w="2161"/>
+        <w:gridCol w:w="2161"/>
+        <w:gridCol w:w="2161"/>
+      </w:tblGrid>
+      <w:tr>
+        <w:tc>
+          <w:tcPr>
+            <w:tcW w:type="dxa" w:w="2161"/>
+          </w:tcPr>
+          <w:p>
+            <w:r>
+              <w:rPr>
+                <w:b/>
+              </w:rPr>
+              <w:t>字段名</w:t>
+            </w:r>
+          </w:p>
+        </w:tc>
+        <w:tc>
+          <w:tcPr>
+            <w:tcW w:type="dxa" w:w="2161"/>
+          </w:tcPr>
+          <w:p>
+            <w:r>
+              <w:rPr>
+                <w:b/>
+              </w:rPr>
+              <w:t>数据类型</w:t>
+            </w:r>
+          </w:p>
+        </w:tc>
+        <w:tc>
+          <w:tcPr>
+            <w:tcW w:type="dxa" w:w="2161"/>
+          </w:tcPr>
+          <w:p>
+            <w:r>
+              <w:rPr>
+                <w:b/>
+              </w:rPr>
+              <w:t>约束</w:t>
+            </w:r>
+          </w:p>
+        </w:tc>
+        <w:tc>
+          <w:tcPr>
+            <w:tcW w:type="dxa" w:w="2161"/>
+          </w:tcPr>
+          <w:p>
+            <w:r>
+              <w:rPr>
+                <w:b/>
+              </w:rPr>
+              <w:t>说明</w:t>
+            </w:r>
+          </w:p>
+        </w:tc>
+      </w:tr>
+      <w:tr>
+        <w:tc>
+          <w:tcPr>
+            <w:tcW w:type="dxa" w:w="2161"/>
+          </w:tcPr>
+          <w:p>
+            <w:r>
+              <w:t>id</w:t>
+            </w:r>
+          </w:p>
+        </w:tc>
+        <w:tc>
+          <w:tcPr>
+            <w:tcW w:type="dxa" w:w="2161"/>
+          </w:tcPr>
+          <w:p>
+            <w:r>
+              <w:t>INTEGER</w:t>
+            </w:r>
+          </w:p>
+        </w:tc>
+        <w:tc>
+          <w:tcPr>
+            <w:tcW w:type="dxa" w:w="2161"/>
+          </w:tcPr>
+          <w:p>
+            <w:r>
+              <w:t>PRIMARY KEY AUTOINCREMENT</w:t>
+            </w:r>
+          </w:p>
+        </w:tc>
+        <w:tc>
+          <w:tcPr>
+            <w:tcW w:type="dxa" w:w="2161"/>
+          </w:tcPr>
+          <w:p>
+            <w:r>
+              <w:t>主键，自增</w:t>
+            </w:r>
+          </w:p>
+        </w:tc>
+      </w:tr>
+      <w:tr>
+        <w:tc>
+          <w:tcPr>
+            <w:tcW w:type="dxa" w:w="2161"/>
+          </w:tcPr>
+          <w:p>
+            <w:r>
+              <w:t>title</w:t>
+            </w:r>
+          </w:p>
+        </w:tc>
+        <w:tc>
+          <w:tcPr>
+            <w:tcW w:type="dxa" w:w="2161"/>
+          </w:tcPr>
+          <w:p>
+            <w:r>
+              <w:t>TEXT</w:t>
+            </w:r>
+          </w:p>
+        </w:tc>
+        <w:tc>
+          <w:tcPr>
+            <w:tcW w:type="dxa" w:w="2161"/>
+          </w:tcPr>
+          <w:p>
+            <w:r>
+              <w:t>NOT NULL</w:t>
+            </w:r>
+          </w:p>
+        </w:tc>
+        <w:tc>
+          <w:tcPr>
+            <w:tcW w:type="dxa" w:w="2161"/>
+          </w:tcPr>
+          <w:p>
+            <w:r>
+              <w:t>待办标题</w:t>
+            </w:r>
+          </w:p>
+        </w:tc>
+      </w:tr>
+      <w:tr>
+        <w:tc>
+          <w:tcPr>
+            <w:tcW w:type="dxa" w:w="2161"/>
+          </w:tcPr>
+          <w:p>
+            <w:r>
+              <w:t>content</w:t>
+            </w:r>
+          </w:p>
+        </w:tc>
+        <w:tc>
+          <w:tcPr>
+            <w:tcW w:type="dxa" w:w="2161"/>
+          </w:tcPr>
+          <w:p>
+            <w:r>
+              <w:t>TEXT</w:t>
+            </w:r>
+          </w:p>
+        </w:tc>
+        <w:tc>
+          <w:tcPr>
+            <w:tcW w:type="dxa" w:w="2161"/>
+          </w:tcPr>
+          <w:p>
+            <w:r/>
+          </w:p>
+        </w:tc>
+        <w:tc>
+          <w:tcPr>
+            <w:tcW w:type="dxa" w:w="2161"/>
+          </w:tcPr>
+          <w:p>
+            <w:r>
+              <w:t>待办内容</w:t>
+            </w:r>
+          </w:p>
+        </w:tc>
+      </w:tr>
+      <w:tr>
+        <w:tc>
+          <w:tcPr>
+            <w:tcW w:type="dxa" w:w="2161"/>
+          </w:tcPr>
+          <w:p>
+            <w:r>
+              <w:t>created_at</w:t>
+            </w:r>
+          </w:p>
+        </w:tc>
+        <w:tc>
+          <w:tcPr>
+            <w:tcW w:type="dxa" w:w="2161"/>
+          </w:tcPr>
+          <w:p>
+            <w:r>
+              <w:t>INTEGER</w:t>
+            </w:r>
+          </w:p>
+        </w:tc>
+        <w:tc>
+          <w:tcPr>
+            <w:tcW w:type="dxa" w:w="2161"/>
+          </w:tcPr>
+          <w:p>
+            <w:r>
+              <w:t>NOT NULL</w:t>
+            </w:r>
+          </w:p>
+        </w:tc>
+        <w:tc>
+          <w:tcPr>
+            <w:tcW w:type="dxa" w:w="2161"/>
+          </w:tcPr>
+          <w:p>
+            <w:r>
+              <w:t>创建时间戳</w:t>
+            </w:r>
+          </w:p>
+        </w:tc>
+      </w:tr>
+      <w:tr>
+        <w:tc>
+          <w:tcPr>
+            <w:tcW w:type="dxa" w:w="2161"/>
+          </w:tcPr>
+          <w:p>
+            <w:r>
+              <w:t>updated_at</w:t>
+            </w:r>
+          </w:p>
+        </w:tc>
+        <w:tc>
+          <w:tcPr>
+            <w:tcW w:type="dxa" w:w="2161"/>
+          </w:tcPr>
+          <w:p>
+            <w:r>
+              <w:t>INTEGER</w:t>
+            </w:r>
+          </w:p>
+        </w:tc>
+        <w:tc>
+          <w:tcPr>
+            <w:tcW w:type="dxa" w:w="2161"/>
+          </w:tcPr>
+          <w:p>
+            <w:r>
+              <w:t>NOT NULL</w:t>
+            </w:r>
+          </w:p>
+        </w:tc>
+        <w:tc>
+          <w:tcPr>
+            <w:tcW w:type="dxa" w:w="2161"/>
+          </w:tcPr>
+          <w:p>
+            <w:r>
+              <w:t>更新时间戳</w:t>
+            </w:r>
+          </w:p>
+        </w:tc>
+      </w:tr>
+      <w:tr>
+        <w:tc>
+          <w:tcPr>
+            <w:tcW w:type="dxa" w:w="2161"/>
+          </w:tcPr>
+          <w:p>
+            <w:r>
+              <w:t>is_completed</w:t>
+            </w:r>
+          </w:p>
+        </w:tc>
+        <w:tc>
+          <w:tcPr>
+            <w:tcW w:type="dxa" w:w="2161"/>
+          </w:tcPr>
+          <w:p>
+            <w:r>
+              <w:t>INTEGER</w:t>
+            </w:r>
+          </w:p>
+        </w:tc>
+        <w:tc>
+          <w:tcPr>
+            <w:tcW w:type="dxa" w:w="2161"/>
+          </w:tcPr>
+          <w:p>
+            <w:r>
+              <w:t>DEFAULT 0</w:t>
+            </w:r>
+          </w:p>
+        </w:tc>
+        <w:tc>
+          <w:tcPr>
+            <w:tcW w:type="dxa" w:w="2161"/>
+          </w:tcPr>
+          <w:p>
+            <w:r>
+              <w:t>完成状态</w:t>
+            </w:r>
+          </w:p>
+        </w:tc>
+      </w:tr>
+    </w:tbl>
+    <w:p>
+      <w:pPr>
+        <w:pStyle w:val="Heading2"/>
+      </w:pPr>
+      <w:r>
+        <w:rPr>
+          <w:color w:val="000000"/>
+        </w:rPr>
+        <w:t>3.3 架构设计</w:t>
+      </w:r>
+    </w:p>
+    <w:p>
+      <w:r>
+        <w:t>采用 MVC（Model-View-Controller）架构：</w:t>
+      </w:r>
+    </w:p>
+    <w:tbl>
+      <w:tblPr>
+        <w:tblStyle w:val="TableGrid"/>
+        <w:tblW w:type="auto" w:w="0"/>
+        <w:tblLook w:firstColumn="1" w:firstRow="1" w:lastColumn="0" w:lastRow="0" w:noHBand="0" w:noVBand="1" w:val="04A0"/>
+      </w:tblPr>
+      <w:tblGrid>
+        <w:gridCol w:w="2882"/>
+        <w:gridCol w:w="2882"/>
+        <w:gridCol w:w="2882"/>
+      </w:tblGrid>
+      <w:tr>
+        <w:tc>
+          <w:tcPr>
+            <w:tcW w:type="dxa" w:w="2882"/>
+          </w:tcPr>
+          <w:p>
+            <w:r>
+              <w:rPr>
+                <w:b/>
+              </w:rPr>
+              <w:t>Activity</w:t>
+            </w:r>
+          </w:p>
+        </w:tc>
+        <w:tc>
+          <w:tcPr>
+            <w:tcW w:type="dxa" w:w="2882"/>
+          </w:tcPr>
+          <w:p>
+            <w:r>
+              <w:rPr>
+                <w:b/>
+              </w:rPr>
+              <w:t>功能</w:t>
+            </w:r>
+          </w:p>
+        </w:tc>
+        <w:tc>
+          <w:tcPr>
+            <w:tcW w:type="dxa" w:w="2882"/>
+          </w:tcPr>
+          <w:p>
+            <w:r>
+              <w:rPr>
+                <w:b/>
+              </w:rPr>
+              <w:t>对应布局</w:t>
+            </w:r>
+          </w:p>
+        </w:tc>
+      </w:tr>
+      <w:tr>
+        <w:tc>
+          <w:tcPr>
+            <w:tcW w:type="dxa" w:w="2882"/>
+          </w:tcPr>
+          <w:p>
+            <w:r>
+              <w:t>MainActivity</w:t>
+            </w:r>
+          </w:p>
+        </w:tc>
+        <w:tc>
+          <w:tcPr>
+            <w:tcW w:type="dxa" w:w="2882"/>
+          </w:tcPr>
+          <w:p>
+            <w:r>
+              <w:t>待办列表展示，入口点</w:t>
+            </w:r>
+          </w:p>
+        </w:tc>
+        <w:tc>
+          <w:tcPr>
+            <w:tcW w:type="dxa" w:w="2882"/>
+          </w:tcPr>
+          <w:p>
+            <w:r>
+              <w:t>activity_main.xml</w:t>
+            </w:r>
+          </w:p>
+        </w:tc>
+      </w:tr>
+      <w:tr>
+        <w:tc>
+          <w:tcPr>
+            <w:tcW w:type="dxa" w:w="2882"/>
+          </w:tcPr>
+          <w:p>
+            <w:r>
+              <w:t>AddEditTodoActivity</w:t>
+            </w:r>
+          </w:p>
+        </w:tc>
+        <w:tc>
+          <w:tcPr>
+            <w:tcW w:type="dxa" w:w="2882"/>
+          </w:tcPr>
+          <w:p>
+            <w:r>
+              <w:t>新增/编辑待办</w:t>
+            </w:r>
+          </w:p>
+        </w:tc>
+        <w:tc>
+          <w:tcPr>
+            <w:tcW w:type="dxa" w:w="2882"/>
+          </w:tcPr>
+          <w:p>
+            <w:r>
+              <w:t>activity_add_edit.xml</w:t>
+            </w:r>
+          </w:p>
+        </w:tc>
+      </w:tr>
+      <w:tr>
+        <w:tc>
+          <w:tcPr>
+            <w:tcW w:type="dxa" w:w="2882"/>
+          </w:tcPr>
+          <w:p>
+            <w:r>
+              <w:t>TodoDetailActivity</w:t>
+            </w:r>
+          </w:p>
+        </w:tc>
+        <w:tc>
+          <w:tcPr>
+            <w:tcW w:type="dxa" w:w="2882"/>
+          </w:tcPr>
+          <w:p>
+            <w:r>
+              <w:t>详情展示、状态切换、删除</w:t>
+            </w:r>
+          </w:p>
+        </w:tc>
+        <w:tc>
+          <w:tcPr>
+            <w:tcW w:type="dxa" w:w="2882"/>
+          </w:tcPr>
+          <w:p>
+            <w:r>
+              <w:t>activity_detail.xml</w:t>
+            </w:r>
+          </w:p>
+        </w:tc>
+      </w:tr>
+    </w:tbl>
+    <w:p>
+      <w:pPr>
+        <w:pStyle w:val="Heading1"/>
+      </w:pPr>
+      <w:r>
+        <w:rPr>
+          <w:color w:val="000000"/>
+        </w:rPr>
+        <w:t>4. 功能实现步骤</w:t>
       </w:r>
     </w:p>
     <w:p>
       <w:pPr>
-        <w:ind w:firstLine="420"/>
+        <w:pStyle w:val="Heading2"/>
       </w:pPr>
       <w:r>
         <w:rPr>
-          <w:rFonts w:ascii="宋体" w:hAnsi="宋体" w:eastAsia="宋体"/>
-          <w:sz w:val="24"/>
+          <w:color w:val="000000"/>
         </w:rPr>
-        <w:t>架构：3个Activity + 数据层 + 适配器层</w:t>
+        <w:t>4.1 数据模型层（Todo.java）</w:t>
+      </w:r>
+    </w:p>
+    <w:p>
+      <w:r>
+        <w:t>封装待办事项的各个属性，提供无参和带参构造函数。无参构造自动设置时间戳和未完成状态。</w:t>
       </w:r>
     </w:p>
     <w:p>
       <w:pPr>
-        <w:ind w:firstLine="420"/>
+        <w:pStyle w:val="Heading2"/>
       </w:pPr>
       <w:r>
         <w:rPr>
-          <w:rFonts w:ascii="宋体" w:hAnsi="宋体" w:eastAsia="宋体"/>
-          <w:b/>
-          <w:sz w:val="24"/>
+          <w:color w:val="000000"/>
         </w:rPr>
-        <w:t>MainActivity：</w:t>
+        <w:t>4.2 数据库层（TodoDatabaseHelper.java）</w:t>
       </w:r>
+    </w:p>
+    <w:p>
       <w:r>
-        <w:rPr>
-          <w:rFonts w:ascii="宋体" w:hAnsi="宋体" w:eastAsia="宋体"/>
-          <w:sz w:val="24"/>
-        </w:rPr>
-        <w:t>主列表页，RecyclerView 展示</w:t>
+        <w:t>继承 SQLiteOpenHelper，在 onCreate 中执行建表语句。封装 insert、update、delete、getById、getAllCursor 五个核心方法。</w:t>
       </w:r>
     </w:p>
     <w:p>
       <w:pPr>
-        <w:ind w:firstLine="420"/>
+        <w:ind w:left="567"/>
       </w:pPr>
       <w:r>
         <w:rPr>
-          <w:rFonts w:ascii="宋体" w:hAnsi="宋体" w:eastAsia="宋体"/>
-          <w:b/>
-          <w:sz w:val="24"/>
+          <w:rFonts w:ascii="Courier New" w:hAnsi="Courier New"/>
+          <w:sz w:val="18"/>
         </w:rPr>
-        <w:t>AddEditTodoActivity：</w:t>
-      </w:r>
-      <w:r>
-        <w:rPr>
-          <w:rFonts w:ascii="宋体" w:hAnsi="宋体" w:eastAsia="宋体"/>
-          <w:sz w:val="24"/>
-        </w:rPr>
-        <w:t>新增/编辑页</w:t>
+        <w:t>// 建表SQL</w:t>
+        <w:br/>
+        <w:t>CREATE TABLE todos (</w:t>
+        <w:br/>
+        <w:t xml:space="preserve">  id INTEGER PRIMARY KEY AUTOINCREMENT,</w:t>
+        <w:br/>
+        <w:t xml:space="preserve">  title TEXT NOT NULL,</w:t>
+        <w:br/>
+        <w:t xml:space="preserve">  content TEXT,</w:t>
+        <w:br/>
+        <w:t xml:space="preserve">  created_at INTEGER NOT NULL,</w:t>
+        <w:br/>
+        <w:t xml:space="preserve">  updated_at INTEGER NOT NULL,</w:t>
+        <w:br/>
+        <w:t xml:space="preserve">  is_completed INTEGER DEFAULT 0</w:t>
+        <w:br/>
+        <w:t>)</w:t>
       </w:r>
     </w:p>
     <w:p>
       <w:pPr>
-        <w:ind w:firstLine="420"/>
+        <w:pStyle w:val="Heading2"/>
       </w:pPr>
       <w:r>
         <w:rPr>
-          <w:rFonts w:ascii="宋体" w:hAnsi="宋体" w:eastAsia="宋体"/>
-          <w:b/>
-          <w:sz w:val="24"/>
+          <w:color w:val="000000"/>
         </w:rPr>
-        <w:t>TodoDetailActivity：</w:t>
+        <w:t>4.3 适配器层（TodoAdapter.java）</w:t>
       </w:r>
+    </w:p>
+    <w:p>
       <w:r>
-        <w:rPr>
-          <w:rFonts w:ascii="宋体" w:hAnsi="宋体" w:eastAsia="宋体"/>
-          <w:sz w:val="24"/>
-        </w:rPr>
-        <w:t>详情页，支持状态切换和删除</w:t>
+        <w:t>TodoAdapter 继承 RecyclerView.Adapter，接收 Cursor 数据源。通过 swapCursor 方法实现数据刷新，避免重新创建 Adapter。提供 OnItemClickListener 回调。</w:t>
       </w:r>
     </w:p>
     <w:p>
       <w:pPr>
-        <w:ind w:firstLine="420"/>
+        <w:jc w:val="center"/>
       </w:pPr>
       <w:r>
-        <w:rPr>
-          <w:rFonts w:ascii="宋体" w:hAnsi="宋体" w:eastAsia="宋体"/>
-          <w:sz w:val="24"/>
-        </w:rPr>
-        <w:t>数据层：SQLite 数据库，TodoDatabaseHelper 封装 CRUD</w:t>
+        <w:drawing>
+          <wp:inline xmlns:a="http://schemas.openxmlformats.org/drawingml/2006/main" xmlns:pic="http://schemas.openxmlformats.org/drawingml/2006/picture">
+            <wp:extent cx="3200400" cy="6934200"/>
+            <wp:docPr id="2" name="Picture 2"/>
+            <wp:cNvGraphicFramePr>
+              <a:graphicFrameLocks noChangeAspect="1"/>
+            </wp:cNvGraphicFramePr>
+            <a:graphic>
+              <a:graphicData uri="http://schemas.openxmlformats.org/drawingml/2006/picture">
+                <pic:pic>
+                  <pic:nvPicPr>
+                    <pic:cNvPr id="0" name="03_todo_list.png"/>
+                    <pic:cNvPicPr/>
+                  </pic:nvPicPr>
+                  <pic:blipFill>
+                    <a:blip r:embed="rId10"/>
+                    <a:stretch>
+                      <a:fillRect/>
+                    </a:stretch>
+                  </pic:blipFill>
+                  <pic:spPr>
+                    <a:xfrm>
+                      <a:off x="0" y="0"/>
+                      <a:ext cx="3200400" cy="6934200"/>
+                    </a:xfrm>
+                    <a:prstGeom prst="rect"/>
+                  </pic:spPr>
+                </pic:pic>
+              </a:graphicData>
+            </a:graphic>
+          </wp:inline>
+        </w:drawing>
       </w:r>
     </w:p>
     <w:p>
       <w:pPr>
-        <w:ind w:firstLine="420"/>
+        <w:jc w:val="center"/>
       </w:pPr>
       <w:r>
         <w:rPr>
-          <w:rFonts w:ascii="宋体" w:hAnsi="宋体" w:eastAsia="宋体"/>
-          <w:sz w:val="24"/>
+          <w:i/>
+          <w:sz w:val="20"/>
         </w:rPr>
-        <w:t>UI：MaterialCardView 列表卡片，ConstraintLayout 布局</w:t>
+        <w:t>图：待办列表界面（MaterialCardView 卡片样式）</w:t>
+      </w:r>
+    </w:p>
+    <w:p>
+      <w:pPr>
+        <w:pStyle w:val="Heading2"/>
+      </w:pPr>
+      <w:r>
+        <w:rPr>
+          <w:color w:val="000000"/>
+        </w:rPr>
+        <w:t>4.4 主界面（MainActivity.java）</w:t>
+      </w:r>
+    </w:p>
+    <w:p>
+      <w:r>
+        <w:t>启动入口 Activity，加载待办列表。使用 RecyclerView 展示数据，FloatingActionButton 作为新建按钮。通过 startActivityForResult 跳转后，在 onResume 中刷新列表。数据库为空时显示提示文字。</w:t>
+      </w:r>
+    </w:p>
+    <w:p>
+      <w:pPr>
+        <w:pStyle w:val="Heading2"/>
+      </w:pPr>
+      <w:r>
+        <w:rPr>
+          <w:color w:val="000000"/>
+        </w:rPr>
+        <w:t>4.5 新增编辑（AddEditTodoActivity.java）</w:t>
+      </w:r>
+    </w:p>
+    <w:p>
+      <w:r>
+        <w:t>新增和编辑共用同一 Activity，通过 Intent 中的 todo_id 进行区分（-1 为新增，其他为编辑）。提供标题非空校验，保存成功后设置 RESULT_OK 返回。</w:t>
+      </w:r>
+    </w:p>
+    <w:p>
+      <w:pPr>
+        <w:jc w:val="center"/>
+      </w:pPr>
+      <w:r>
+        <w:drawing>
+          <wp:inline xmlns:a="http://schemas.openxmlformats.org/drawingml/2006/main" xmlns:pic="http://schemas.openxmlformats.org/drawingml/2006/picture">
+            <wp:extent cx="3200400" cy="6934200"/>
+            <wp:docPr id="3" name="Picture 3"/>
+            <wp:cNvGraphicFramePr>
+              <a:graphicFrameLocks noChangeAspect="1"/>
+            </wp:cNvGraphicFramePr>
+            <a:graphic>
+              <a:graphicData uri="http://schemas.openxmlformats.org/drawingml/2006/picture">
+                <pic:pic>
+                  <pic:nvPicPr>
+                    <pic:cNvPr id="0" name="02_add_todo.png"/>
+                    <pic:cNvPicPr/>
+                  </pic:nvPicPr>
+                  <pic:blipFill>
+                    <a:blip r:embed="rId11"/>
+                    <a:stretch>
+                      <a:fillRect/>
+                    </a:stretch>
+                  </pic:blipFill>
+                  <pic:spPr>
+                    <a:xfrm>
+                      <a:off x="0" y="0"/>
+                      <a:ext cx="3200400" cy="6934200"/>
+                    </a:xfrm>
+                    <a:prstGeom prst="rect"/>
+                  </pic:spPr>
+                </pic:pic>
+              </a:graphicData>
+            </a:graphic>
+          </wp:inline>
+        </w:drawing>
+      </w:r>
+    </w:p>
+    <w:p>
+      <w:pPr>
+        <w:jc w:val="center"/>
+      </w:pPr>
+      <w:r>
+        <w:rPr>
+          <w:i/>
+          <w:sz w:val="20"/>
+        </w:rPr>
+        <w:t>图：新增待办页面</w:t>
+      </w:r>
+    </w:p>
+    <w:p>
+      <w:pPr>
+        <w:jc w:val="center"/>
+      </w:pPr>
+      <w:r>
+        <w:drawing>
+          <wp:inline xmlns:a="http://schemas.openxmlformats.org/drawingml/2006/main" xmlns:pic="http://schemas.openxmlformats.org/drawingml/2006/picture">
+            <wp:extent cx="3200400" cy="6934200"/>
+            <wp:docPr id="4" name="Picture 4"/>
+            <wp:cNvGraphicFramePr>
+              <a:graphicFrameLocks noChangeAspect="1"/>
+            </wp:cNvGraphicFramePr>
+            <a:graphic>
+              <a:graphicData uri="http://schemas.openxmlformats.org/drawingml/2006/picture">
+                <pic:pic>
+                  <pic:nvPicPr>
+                    <pic:cNvPr id="0" name="05_edit_page.png"/>
+                    <pic:cNvPicPr/>
+                  </pic:nvPicPr>
+                  <pic:blipFill>
+                    <a:blip r:embed="rId12"/>
+                    <a:stretch>
+                      <a:fillRect/>
+                    </a:stretch>
+                  </pic:blipFill>
+                  <pic:spPr>
+                    <a:xfrm>
+                      <a:off x="0" y="0"/>
+                      <a:ext cx="3200400" cy="6934200"/>
+                    </a:xfrm>
+                    <a:prstGeom prst="rect"/>
+                  </pic:spPr>
+                </pic:pic>
+              </a:graphicData>
+            </a:graphic>
+          </wp:inline>
+        </w:drawing>
+      </w:r>
+    </w:p>
+    <w:p>
+      <w:pPr>
+        <w:jc w:val="center"/>
+      </w:pPr>
+      <w:r>
+        <w:rPr>
+          <w:i/>
+          <w:sz w:val="20"/>
+        </w:rPr>
+        <w:t>图：编辑待办页面</w:t>
+      </w:r>
+    </w:p>
+    <w:p>
+      <w:pPr>
+        <w:pStyle w:val="Heading2"/>
+      </w:pPr>
+      <w:r>
+        <w:rPr>
+          <w:color w:val="000000"/>
+        </w:rPr>
+        <w:t>4.6 待办详情（TodoDetailActivity.java）</w:t>
+      </w:r>
+    </w:p>
+    <w:p>
+      <w:r>
+        <w:t>详情页以 CardView 展示完整内容，底部提供状态切换和删除按钮。工具栏添加编辑按钮（Menu Item），删除操作弹出确认对话框。</w:t>
+      </w:r>
+    </w:p>
+    <w:p>
+      <w:pPr>
+        <w:jc w:val="center"/>
+      </w:pPr>
+      <w:r>
+        <w:drawing>
+          <wp:inline xmlns:a="http://schemas.openxmlformats.org/drawingml/2006/main" xmlns:pic="http://schemas.openxmlformats.org/drawingml/2006/picture">
+            <wp:extent cx="3200400" cy="6934200"/>
+            <wp:docPr id="5" name="Picture 5"/>
+            <wp:cNvGraphicFramePr>
+              <a:graphicFrameLocks noChangeAspect="1"/>
+            </wp:cNvGraphicFramePr>
+            <a:graphic>
+              <a:graphicData uri="http://schemas.openxmlformats.org/drawingml/2006/picture">
+                <pic:pic>
+                  <pic:nvPicPr>
+                    <pic:cNvPr id="0" name="02_add_todo.png"/>
+                    <pic:cNvPicPr/>
+                  </pic:nvPicPr>
+                  <pic:blipFill>
+                    <a:blip r:embed="rId11"/>
+                    <a:stretch>
+                      <a:fillRect/>
+                    </a:stretch>
+                  </pic:blipFill>
+                  <pic:spPr>
+                    <a:xfrm>
+                      <a:off x="0" y="0"/>
+                      <a:ext cx="3200400" cy="6934200"/>
+                    </a:xfrm>
+                    <a:prstGeom prst="rect"/>
+                  </pic:spPr>
+                </pic:pic>
+              </a:graphicData>
+            </a:graphic>
+          </wp:inline>
+        </w:drawing>
+      </w:r>
+    </w:p>
+    <w:p>
+      <w:pPr>
+        <w:jc w:val="center"/>
+      </w:pPr>
+      <w:r>
+        <w:rPr>
+          <w:i/>
+          <w:sz w:val="20"/>
+        </w:rPr>
+        <w:t>图：待办详情页</w:t>
+      </w:r>
+    </w:p>
+    <w:p>
+      <w:pPr>
+        <w:jc w:val="center"/>
+      </w:pPr>
+      <w:r>
+        <w:drawing>
+          <wp:inline xmlns:a="http://schemas.openxmlformats.org/drawingml/2006/main" xmlns:pic="http://schemas.openxmlformats.org/drawingml/2006/picture">
+            <wp:extent cx="3200400" cy="6934200"/>
+            <wp:docPr id="6" name="Picture 6"/>
+            <wp:cNvGraphicFramePr>
+              <a:graphicFrameLocks noChangeAspect="1"/>
+            </wp:cNvGraphicFramePr>
+            <a:graphic>
+              <a:graphicData uri="http://schemas.openxmlformats.org/drawingml/2006/picture">
+                <pic:pic>
+                  <pic:nvPicPr>
+                    <pic:cNvPr id="0" name="06_status_completed.png"/>
+                    <pic:cNvPicPr/>
+                  </pic:nvPicPr>
+                  <pic:blipFill>
+                    <a:blip r:embed="rId13"/>
+                    <a:stretch>
+                      <a:fillRect/>
+                    </a:stretch>
+                  </pic:blipFill>
+                  <pic:spPr>
+                    <a:xfrm>
+                      <a:off x="0" y="0"/>
+                      <a:ext cx="3200400" cy="6934200"/>
+                    </a:xfrm>
+                    <a:prstGeom prst="rect"/>
+                  </pic:spPr>
+                </pic:pic>
+              </a:graphicData>
+            </a:graphic>
+          </wp:inline>
+        </w:drawing>
+      </w:r>
+    </w:p>
+    <w:p>
+      <w:pPr>
+        <w:jc w:val="center"/>
+      </w:pPr>
+      <w:r>
+        <w:rPr>
+          <w:i/>
+          <w:sz w:val="20"/>
+        </w:rPr>
+        <w:t>图：已完成状态</w:t>
+      </w:r>
+    </w:p>
+    <w:p>
+      <w:pPr>
+        <w:jc w:val="center"/>
+      </w:pPr>
+      <w:r>
+        <w:drawing>
+          <wp:inline xmlns:a="http://schemas.openxmlformats.org/drawingml/2006/main" xmlns:pic="http://schemas.openxmlformats.org/drawingml/2006/picture">
+            <wp:extent cx="3200400" cy="6934200"/>
+            <wp:docPr id="7" name="Picture 7"/>
+            <wp:cNvGraphicFramePr>
+              <a:graphicFrameLocks noChangeAspect="1"/>
+            </wp:cNvGraphicFramePr>
+            <a:graphic>
+              <a:graphicData uri="http://schemas.openxmlformats.org/drawingml/2006/picture">
+                <pic:pic>
+                  <pic:nvPicPr>
+                    <pic:cNvPr id="0" name="07_delete_confirm.png"/>
+                    <pic:cNvPicPr/>
+                  </pic:nvPicPr>
+                  <pic:blipFill>
+                    <a:blip r:embed="rId14"/>
+                    <a:stretch>
+                      <a:fillRect/>
+                    </a:stretch>
+                  </pic:blipFill>
+                  <pic:spPr>
+                    <a:xfrm>
+                      <a:off x="0" y="0"/>
+                      <a:ext cx="3200400" cy="6934200"/>
+                    </a:xfrm>
+                    <a:prstGeom prst="rect"/>
+                  </pic:spPr>
+                </pic:pic>
+              </a:graphicData>
+            </a:graphic>
+          </wp:inline>
+        </w:drawing>
+      </w:r>
+    </w:p>
+    <w:p>
+      <w:pPr>
+        <w:jc w:val="center"/>
+      </w:pPr>
+      <w:r>
+        <w:rPr>
+          <w:i/>
+          <w:sz w:val="20"/>
+        </w:rPr>
+        <w:t>图：删除确认弹窗</w:t>
       </w:r>
     </w:p>
     <w:p>
@@ -418,81 +1578,51 @@
       </w:pPr>
       <w:r>
         <w:rPr>
-          <w:rFonts w:ascii="黑体" w:hAnsi="黑体" w:eastAsia="黑体"/>
+          <w:color w:val="000000"/>
         </w:rPr>
-        <w:t>四、功能实现步骤</w:t>
+        <w:t>5. 遇到的问题及解决办法</w:t>
+      </w:r>
+    </w:p>
+    <w:p>
+      <w:pPr>
+        <w:pStyle w:val="Heading2"/>
+      </w:pPr>
+      <w:r>
+        <w:rPr>
+          <w:color w:val="000000"/>
+        </w:rPr>
+        <w:t>5.1 Toolbar 集成</w:t>
       </w:r>
     </w:p>
     <w:p>
       <w:r>
-        <w:rPr>
-          <w:rFonts w:ascii="宋体" w:hAnsi="宋体" w:eastAsia="宋体"/>
-          <w:sz w:val="24"/>
-        </w:rPr>
-        <w:t>(a) 创建 Android 项目，配置 Gradle 依赖</w:t>
+        <w:t>问题：使用 NoActionBar 主题导致 onCreateOptionsMenu 无法显示，详情页工具栏编辑按钮不可见。</w:t>
       </w:r>
     </w:p>
     <w:p>
       <w:r>
+        <w:t>解决：在 activity_detail.xml 中手动添加 Toolbar 控件，通过 setSupportActionBar(toolbar) 设为 ActionBar，并启用 setDisplayHomeAsUpEnabled(true)。</w:t>
+      </w:r>
+    </w:p>
+    <w:p>
+      <w:pPr>
+        <w:pStyle w:val="Heading2"/>
+      </w:pPr>
+      <w:r>
         <w:rPr>
-          <w:rFonts w:ascii="宋体" w:hAnsi="宋体" w:eastAsia="宋体"/>
-          <w:sz w:val="24"/>
+          <w:color w:val="000000"/>
         </w:rPr>
-        <w:t>(b) 设计数据模型 Todo.java，定义字段</w:t>
+        <w:t>5.2 RecyclerView 数据刷新</w:t>
       </w:r>
     </w:p>
     <w:p>
       <w:r>
-        <w:rPr>
-          <w:rFonts w:ascii="宋体" w:hAnsi="宋体" w:eastAsia="宋体"/>
-          <w:sz w:val="24"/>
-        </w:rPr>
-        <w:t>(c) 实现 TodoDatabaseHelper，建表并封装增删改查</w:t>
+        <w:t>问题： Activity 之间跳转返回后，列表需要刷新但无法直接回调。</w:t>
       </w:r>
     </w:p>
     <w:p>
       <w:r>
-        <w:rPr>
-          <w:rFonts w:ascii="宋体" w:hAnsi="宋体" w:eastAsia="宋体"/>
-          <w:sz w:val="24"/>
-        </w:rPr>
-        <w:t>(d) 实现 TodoAdapter，绑定数据到 RecyclerView</w:t>
-      </w:r>
-    </w:p>
-    <w:p>
-      <w:r>
-        <w:rPr>
-          <w:rFonts w:ascii="宋体" w:hAnsi="宋体" w:eastAsia="宋体"/>
-          <w:sz w:val="24"/>
-        </w:rPr>
-        <w:t>(e) 实现 MainActivity，加载列表并响应点击</w:t>
-      </w:r>
-    </w:p>
-    <w:p>
-      <w:r>
-        <w:rPr>
-          <w:rFonts w:ascii="宋体" w:hAnsi="宋体" w:eastAsia="宋体"/>
-          <w:sz w:val="24"/>
-        </w:rPr>
-        <w:t>(f) 实现 AddEditTodoActivity，处理新增和编辑</w:t>
-      </w:r>
-    </w:p>
-    <w:p>
-      <w:r>
-        <w:rPr>
-          <w:rFonts w:ascii="宋体" w:hAnsi="宋体" w:eastAsia="宋体"/>
-          <w:sz w:val="24"/>
-        </w:rPr>
-        <w:t>(g) 实现 TodoDetailActivity，显示详情并处理状态切换和删除</w:t>
-      </w:r>
-    </w:p>
-    <w:p>
-      <w:r>
-        <w:rPr>
-          <w:rFonts w:ascii="宋体" w:hAnsi="宋体" w:eastAsia="宋体"/>
-          <w:sz w:val="24"/>
-        </w:rPr>
-        <w:t>(h) 配置 AndroidManifest，注册所有 Activity</w:t>
+        <w:t>解决：Adapter 实现 swapCursor 方法，MainActivity 在 onResume 中调用 loadTodos 刷新。</w:t>
       </w:r>
     </w:p>
     <w:p>
@@ -501,130 +1631,19 @@
       </w:pPr>
       <w:r>
         <w:rPr>
-          <w:rFonts w:ascii="黑体" w:hAnsi="黑体" w:eastAsia="黑体"/>
+          <w:color w:val="000000"/>
         </w:rPr>
-        <w:t>五、遇到的问题及解决办法</w:t>
+        <w:t>6. 总结与展望</w:t>
       </w:r>
     </w:p>
     <w:p>
-      <w:pPr>
-        <w:ind w:firstLine="420"/>
-      </w:pPr>
       <w:r>
-        <w:rPr>
-          <w:rFonts w:ascii="宋体" w:hAnsi="宋体" w:eastAsia="宋体"/>
-          <w:b/>
-          <w:sz w:val="24"/>
-        </w:rPr>
-        <w:t>问题1：RecyclerView 配合 Cursor 数据刷新。</w:t>
-      </w:r>
-      <w:r>
-        <w:rPr>
-          <w:rFonts w:ascii="宋体" w:hAnsi="宋体" w:eastAsia="宋体"/>
-          <w:sz w:val="24"/>
-        </w:rPr>
-      </w:r>
-    </w:p>
-    <w:p>
-      <w:pPr>
-        <w:ind w:firstLine="839"/>
-      </w:pPr>
-      <w:r>
-        <w:rPr>
-          <w:rFonts w:ascii="宋体" w:hAnsi="宋体" w:eastAsia="宋体"/>
-          <w:sz w:val="24"/>
-        </w:rPr>
-        <w:t>解决方法：通过 swapCursor 方法在数据集变化时刷新列表</w:t>
-      </w:r>
-    </w:p>
-    <w:p>
-      <w:pPr>
-        <w:ind w:firstLine="420"/>
-      </w:pPr>
-      <w:r>
-        <w:rPr>
-          <w:rFonts w:ascii="宋体" w:hAnsi="宋体" w:eastAsia="宋体"/>
-          <w:b/>
-          <w:sz w:val="24"/>
-        </w:rPr>
-        <w:t>问题2：编辑和新增共用同一 Activity。</w:t>
-      </w:r>
-      <w:r>
-        <w:rPr>
-          <w:rFonts w:ascii="宋体" w:hAnsi="宋体" w:eastAsia="宋体"/>
-          <w:sz w:val="24"/>
-        </w:rPr>
-      </w:r>
-    </w:p>
-    <w:p>
-      <w:pPr>
-        <w:ind w:firstLine="839"/>
-      </w:pPr>
-      <w:r>
-        <w:rPr>
-          <w:rFonts w:ascii="宋体" w:hAnsi="宋体" w:eastAsia="宋体"/>
-          <w:sz w:val="24"/>
-        </w:rPr>
-        <w:t>解决方法：通过 Intent 传递 todo_id 区分，-1 为新增，其他为编辑</w:t>
-      </w:r>
-    </w:p>
-    <w:p>
-      <w:pPr>
-        <w:ind w:firstLine="420"/>
-      </w:pPr>
-      <w:r>
-        <w:rPr>
-          <w:rFonts w:ascii="宋体" w:hAnsi="宋体" w:eastAsia="宋体"/>
-          <w:b/>
-          <w:sz w:val="24"/>
-        </w:rPr>
-        <w:t>问题3：添加 import 的问题。</w:t>
-      </w:r>
-      <w:r>
-        <w:rPr>
-          <w:rFonts w:ascii="宋体" w:hAnsi="宋体" w:eastAsia="宋体"/>
-          <w:sz w:val="24"/>
-        </w:rPr>
-      </w:r>
-    </w:p>
-    <w:p>
-      <w:pPr>
-        <w:ind w:firstLine="839"/>
-      </w:pPr>
-      <w:r>
-        <w:rPr>
-          <w:rFonts w:ascii="宋体" w:hAnsi="宋体" w:eastAsia="宋体"/>
-          <w:sz w:val="24"/>
-        </w:rPr>
-        <w:t>解决方法：检查代码中的隐式引用并手动导入</w:t>
-      </w:r>
-    </w:p>
-    <w:p>
-      <w:pPr>
-        <w:pStyle w:val="Heading1"/>
-      </w:pPr>
-      <w:r>
-        <w:rPr>
-          <w:rFonts w:ascii="黑体" w:hAnsi="黑体" w:eastAsia="黑体"/>
-        </w:rPr>
-        <w:t>六、总结与展望</w:t>
-      </w:r>
-    </w:p>
-    <w:p>
-      <w:pPr>
-        <w:ind w:firstLine="420"/>
-      </w:pPr>
-      <w:r>
-        <w:rPr>
-          <w:rFonts w:ascii="宋体" w:hAnsi="宋体" w:eastAsia="宋体"/>
-          <w:sz w:val="24"/>
-        </w:rPr>
-        <w:t>本次课程设计完成了简易待办 App 的核心功能，采用原生 Android 开发技术栈，界面遵循 Material Design 规范。后续可增加提醒功能、标签分类、搜索等扩展功能。</w:t>
+        <w:t>本次课程设计完成了基于安卓的简易待办应用的全部核心功能，包括待办的创建、查看、编辑、删除和状态管理。通过本次实践，掌握了Activity 生命周期、SQLite 数据库操作、RecyclerView 列表展示、Material Design 组件使用等关键技术。</w:t>
       </w:r>
     </w:p>
     <w:sectPr>
       <w:pgSz w:w="12240" w:h="15840"/>
-      <w:pgMar w:top="1440" w:right="1800" w:bottom="1440" w:left="1800" w:header="720" w:footer="720" w:gutter="0"/>
+      <w:pgMar w:top="1440" w:right="1797" w:bottom="1440" w:left="1797" w:header="720" w:footer="720" w:gutter="0"/>
       <w:cols w:space="720"/>
       <w:docGrid w:linePitch="360"/>
     </w:sectPr>
@@ -996,7 +2015,7 @@
     <w:qFormat/>
     <w:rsid w:val="00FC693F"/>
     <w:rPr>
-      <w:rFonts w:ascii="宋体" w:hAnsi="宋体" w:eastAsia="宋体"/>
+      <w:rFonts w:ascii="宋体" w:hAnsi="宋体"/>
       <w:sz w:val="24"/>
     </w:rPr>
   </w:style>

</xml_diff>

<commit_message>
Update report & defense PPT with Material 3 UI
</commit_message>
<xml_diff>
--- a/report/202325040118_连佳炜_简易待办课程设计报告.docx
+++ b/report/202325040118_连佳炜_简易待办课程设计报告.docx
@@ -4,16 +4,14 @@
   <w:body>
     <w:p/>
     <w:p/>
-    <w:p/>
-    <w:p/>
-    <w:p/>
-    <w:p/>
     <w:p>
       <w:pPr>
+        <w:spacing w:after="80"/>
         <w:jc w:val="center"/>
       </w:pPr>
       <w:r>
         <w:rPr>
+          <w:rFonts w:ascii="宋体" w:hAnsi="宋体" w:eastAsia="宋体"/>
           <w:b/>
           <w:sz w:val="44"/>
         </w:rPr>
@@ -22,10 +20,12 @@
     </w:p>
     <w:p>
       <w:pPr>
+        <w:spacing w:after="80"/>
         <w:jc w:val="center"/>
       </w:pPr>
       <w:r>
         <w:rPr>
+          <w:rFonts w:ascii="宋体" w:hAnsi="宋体" w:eastAsia="宋体"/>
           <w:b/>
           <w:sz w:val="36"/>
         </w:rPr>
@@ -34,56 +34,69 @@
     </w:p>
     <w:p>
       <w:pPr>
+        <w:spacing w:after="400"/>
         <w:jc w:val="center"/>
       </w:pPr>
       <w:r>
         <w:rPr>
+          <w:rFonts w:ascii="宋体" w:hAnsi="宋体" w:eastAsia="宋体"/>
           <w:b/>
           <w:sz w:val="36"/>
         </w:rPr>
         <w:t>课程设计报告</w:t>
       </w:r>
     </w:p>
-    <w:p/>
     <w:p>
       <w:pPr>
+        <w:spacing w:after="800"/>
         <w:jc w:val="center"/>
       </w:pPr>
       <w:r>
         <w:rPr>
-          <w:sz w:val="28"/>
+          <w:rFonts w:ascii="宋体" w:hAnsi="宋体" w:eastAsia="宋体"/>
+          <w:b w:val="0"/>
+          <w:sz w:val="32"/>
         </w:rPr>
         <w:t>题目：基于安卓的简易待办应用开发</w:t>
       </w:r>
     </w:p>
     <w:p>
       <w:pPr>
+        <w:spacing w:after="80"/>
         <w:jc w:val="center"/>
       </w:pPr>
       <w:r>
         <w:rPr>
+          <w:rFonts w:ascii="宋体" w:hAnsi="宋体" w:eastAsia="宋体"/>
+          <w:b w:val="0"/>
           <w:sz w:val="28"/>
         </w:rPr>
-        <w:t>学号：202325040118</w:t>
+        <w:t>学    号：202325040118</w:t>
       </w:r>
     </w:p>
     <w:p>
       <w:pPr>
+        <w:spacing w:after="80"/>
         <w:jc w:val="center"/>
       </w:pPr>
       <w:r>
         <w:rPr>
+          <w:rFonts w:ascii="宋体" w:hAnsi="宋体" w:eastAsia="宋体"/>
+          <w:b w:val="0"/>
           <w:sz w:val="28"/>
         </w:rPr>
-        <w:t>姓名：连佳炊</w:t>
+        <w:t>姓    名：连佳炜</w:t>
       </w:r>
     </w:p>
     <w:p>
       <w:pPr>
+        <w:spacing w:after="80"/>
         <w:jc w:val="center"/>
       </w:pPr>
       <w:r>
         <w:rPr>
+          <w:rFonts w:ascii="宋体" w:hAnsi="宋体" w:eastAsia="宋体"/>
+          <w:b w:val="0"/>
           <w:sz w:val="28"/>
         </w:rPr>
         <w:t>专业班级：计算机科学与技术</w:t>
@@ -91,10 +104,13 @@
     </w:p>
     <w:p>
       <w:pPr>
+        <w:spacing w:after="80"/>
         <w:jc w:val="center"/>
       </w:pPr>
       <w:r>
         <w:rPr>
+          <w:rFonts w:ascii="宋体" w:hAnsi="宋体" w:eastAsia="宋体"/>
+          <w:b w:val="0"/>
           <w:sz w:val="28"/>
         </w:rPr>
         <w:t>二级学院：信息工程学院</w:t>
@@ -111,14 +127,22 @@
       </w:pPr>
       <w:r>
         <w:rPr>
-          <w:color w:val="000000"/>
+          <w:color w:val="006B5E"/>
         </w:rPr>
         <w:t>1. 项目背景</w:t>
       </w:r>
     </w:p>
     <w:p>
+      <w:pPr>
+        <w:spacing w:after="120"/>
+      </w:pPr>
       <w:r>
-        <w:t>随着移动互联网的快速发展，人们在快节奏的学习和工作中常常需要记录各种待办事项。本次课程设计基于 Android 平台开发一个简易待办应用，满足用户对日常任务管理的核心需求。</w:t>
+        <w:rPr>
+          <w:rFonts w:ascii="宋体" w:hAnsi="宋体" w:eastAsia="宋体"/>
+          <w:b w:val="0"/>
+          <w:sz w:val="24"/>
+        </w:rPr>
+        <w:t>随着移动互联网的快速发展，人们在快节奏的学习和工作中常常需要记录各种待办事项。本次课程设计基于 Android 平台开发一个简易待办应用（SimpleTodoApp），满足用户对日常任务管理的核心需求。应用采用 Java 语言开发，使用 SQLite 本地数据库存储数据，UI 基于 Material Design 3（Material You）设计规范，界面清爽现代。</w:t>
       </w:r>
     </w:p>
     <w:p>
@@ -127,35 +151,46 @@
       </w:pPr>
       <w:r>
         <w:rPr>
-          <w:color w:val="000000"/>
+          <w:color w:val="006B5E"/>
         </w:rPr>
         <w:t>2. 功能需求分析</w:t>
       </w:r>
     </w:p>
     <w:p>
+      <w:pPr>
+        <w:spacing w:after="120"/>
+      </w:pPr>
       <w:r>
+        <w:rPr>
+          <w:rFonts w:ascii="宋体" w:hAnsi="宋体" w:eastAsia="宋体"/>
+          <w:b w:val="0"/>
+          <w:sz w:val="24"/>
+        </w:rPr>
         <w:t>本应用包含以下五个核心功能：</w:t>
       </w:r>
     </w:p>
     <w:tbl>
       <w:tblPr>
-        <w:tblStyle w:val="TableGrid"/>
+        <w:tblStyle w:val="LightGrid-Accent1"/>
         <w:tblW w:type="auto" w:w="0"/>
         <w:jc w:val="center"/>
         <w:tblLook w:firstColumn="1" w:firstRow="1" w:lastColumn="0" w:lastRow="0" w:noHBand="0" w:noVBand="1" w:val="04A0"/>
       </w:tblPr>
       <w:tblGrid>
-        <w:gridCol w:w="2161"/>
-        <w:gridCol w:w="2161"/>
-        <w:gridCol w:w="2161"/>
-        <w:gridCol w:w="2161"/>
+        <w:gridCol w:w="2160"/>
+        <w:gridCol w:w="2160"/>
+        <w:gridCol w:w="2160"/>
+        <w:gridCol w:w="2160"/>
       </w:tblGrid>
       <w:tr>
         <w:tc>
           <w:tcPr>
-            <w:tcW w:type="dxa" w:w="2161"/>
+            <w:tcW w:type="dxa" w:w="2160"/>
           </w:tcPr>
           <w:p>
+            <w:pPr>
+              <w:jc w:val="center"/>
+            </w:pPr>
             <w:r>
               <w:rPr>
                 <w:b/>
@@ -166,9 +201,12 @@
         </w:tc>
         <w:tc>
           <w:tcPr>
-            <w:tcW w:type="dxa" w:w="2161"/>
+            <w:tcW w:type="dxa" w:w="2160"/>
           </w:tcPr>
           <w:p>
+            <w:pPr>
+              <w:jc w:val="center"/>
+            </w:pPr>
             <w:r>
               <w:rPr>
                 <w:b/>
@@ -179,9 +217,12 @@
         </w:tc>
         <w:tc>
           <w:tcPr>
-            <w:tcW w:type="dxa" w:w="2161"/>
+            <w:tcW w:type="dxa" w:w="2160"/>
           </w:tcPr>
           <w:p>
+            <w:pPr>
+              <w:jc w:val="center"/>
+            </w:pPr>
             <w:r>
               <w:rPr>
                 <w:b/>
@@ -192,9 +233,12 @@
         </w:tc>
         <w:tc>
           <w:tcPr>
-            <w:tcW w:type="dxa" w:w="2161"/>
+            <w:tcW w:type="dxa" w:w="2160"/>
           </w:tcPr>
           <w:p>
+            <w:pPr>
+              <w:jc w:val="center"/>
+            </w:pPr>
             <w:r>
               <w:rPr>
                 <w:b/>
@@ -207,7 +251,7 @@
       <w:tr>
         <w:tc>
           <w:tcPr>
-            <w:tcW w:type="dxa" w:w="2161"/>
+            <w:tcW w:type="dxa" w:w="2160"/>
           </w:tcPr>
           <w:p>
             <w:r>
@@ -217,7 +261,7 @@
         </w:tc>
         <w:tc>
           <w:tcPr>
-            <w:tcW w:type="dxa" w:w="2161"/>
+            <w:tcW w:type="dxa" w:w="2160"/>
           </w:tcPr>
           <w:p>
             <w:r>
@@ -227,7 +271,7 @@
         </w:tc>
         <w:tc>
           <w:tcPr>
-            <w:tcW w:type="dxa" w:w="2161"/>
+            <w:tcW w:type="dxa" w:w="2160"/>
           </w:tcPr>
           <w:p>
             <w:r>
@@ -237,7 +281,7 @@
         </w:tc>
         <w:tc>
           <w:tcPr>
-            <w:tcW w:type="dxa" w:w="2161"/>
+            <w:tcW w:type="dxa" w:w="2160"/>
           </w:tcPr>
           <w:p>
             <w:r>
@@ -249,7 +293,7 @@
       <w:tr>
         <w:tc>
           <w:tcPr>
-            <w:tcW w:type="dxa" w:w="2161"/>
+            <w:tcW w:type="dxa" w:w="2160"/>
           </w:tcPr>
           <w:p>
             <w:r>
@@ -259,7 +303,7 @@
         </w:tc>
         <w:tc>
           <w:tcPr>
-            <w:tcW w:type="dxa" w:w="2161"/>
+            <w:tcW w:type="dxa" w:w="2160"/>
           </w:tcPr>
           <w:p>
             <w:r>
@@ -269,7 +313,7 @@
         </w:tc>
         <w:tc>
           <w:tcPr>
-            <w:tcW w:type="dxa" w:w="2161"/>
+            <w:tcW w:type="dxa" w:w="2160"/>
           </w:tcPr>
           <w:p>
             <w:r>
@@ -279,7 +323,7 @@
         </w:tc>
         <w:tc>
           <w:tcPr>
-            <w:tcW w:type="dxa" w:w="2161"/>
+            <w:tcW w:type="dxa" w:w="2160"/>
           </w:tcPr>
           <w:p>
             <w:r>
@@ -291,7 +335,7 @@
       <w:tr>
         <w:tc>
           <w:tcPr>
-            <w:tcW w:type="dxa" w:w="2161"/>
+            <w:tcW w:type="dxa" w:w="2160"/>
           </w:tcPr>
           <w:p>
             <w:r>
@@ -301,7 +345,7 @@
         </w:tc>
         <w:tc>
           <w:tcPr>
-            <w:tcW w:type="dxa" w:w="2161"/>
+            <w:tcW w:type="dxa" w:w="2160"/>
           </w:tcPr>
           <w:p>
             <w:r>
@@ -311,17 +355,17 @@
         </w:tc>
         <w:tc>
           <w:tcPr>
-            <w:tcW w:type="dxa" w:w="2161"/>
+            <w:tcW w:type="dxa" w:w="2160"/>
           </w:tcPr>
           <w:p>
             <w:r>
-              <w:t>在详情页修改待办内容</w:t>
+              <w:t>在详情页或编辑页修改待办内容</w:t>
             </w:r>
           </w:p>
         </w:tc>
         <w:tc>
           <w:tcPr>
-            <w:tcW w:type="dxa" w:w="2161"/>
+            <w:tcW w:type="dxa" w:w="2160"/>
           </w:tcPr>
           <w:p>
             <w:r>
@@ -333,7 +377,7 @@
       <w:tr>
         <w:tc>
           <w:tcPr>
-            <w:tcW w:type="dxa" w:w="2161"/>
+            <w:tcW w:type="dxa" w:w="2160"/>
           </w:tcPr>
           <w:p>
             <w:r>
@@ -343,7 +387,7 @@
         </w:tc>
         <w:tc>
           <w:tcPr>
-            <w:tcW w:type="dxa" w:w="2161"/>
+            <w:tcW w:type="dxa" w:w="2160"/>
           </w:tcPr>
           <w:p>
             <w:r>
@@ -353,7 +397,7 @@
         </w:tc>
         <w:tc>
           <w:tcPr>
-            <w:tcW w:type="dxa" w:w="2161"/>
+            <w:tcW w:type="dxa" w:w="2160"/>
           </w:tcPr>
           <w:p>
             <w:r>
@@ -363,7 +407,7 @@
         </w:tc>
         <w:tc>
           <w:tcPr>
-            <w:tcW w:type="dxa" w:w="2161"/>
+            <w:tcW w:type="dxa" w:w="2160"/>
           </w:tcPr>
           <w:p>
             <w:r>
@@ -375,7 +419,7 @@
       <w:tr>
         <w:tc>
           <w:tcPr>
-            <w:tcW w:type="dxa" w:w="2161"/>
+            <w:tcW w:type="dxa" w:w="2160"/>
           </w:tcPr>
           <w:p>
             <w:r>
@@ -385,7 +429,7 @@
         </w:tc>
         <w:tc>
           <w:tcPr>
-            <w:tcW w:type="dxa" w:w="2161"/>
+            <w:tcW w:type="dxa" w:w="2160"/>
           </w:tcPr>
           <w:p>
             <w:r>
@@ -395,17 +439,17 @@
         </w:tc>
         <w:tc>
           <w:tcPr>
-            <w:tcW w:type="dxa" w:w="2161"/>
+            <w:tcW w:type="dxa" w:w="2160"/>
           </w:tcPr>
           <w:p>
             <w:r>
-              <w:t>标记待办为已完成/未完成</w:t>
+              <w:t>标记待办为已完成 / 未完成</w:t>
             </w:r>
           </w:p>
         </w:tc>
         <w:tc>
           <w:tcPr>
-            <w:tcW w:type="dxa" w:w="2161"/>
+            <w:tcW w:type="dxa" w:w="2160"/>
           </w:tcPr>
           <w:p>
             <w:r>
@@ -415,56 +459,22 @@
         </w:tc>
       </w:tr>
     </w:tbl>
-    <w:p/>
     <w:p>
       <w:pPr>
-        <w:jc w:val="center"/>
+        <w:spacing w:after="120"/>
       </w:pPr>
       <w:r>
-        <w:drawing>
-          <wp:inline xmlns:a="http://schemas.openxmlformats.org/drawingml/2006/main" xmlns:pic="http://schemas.openxmlformats.org/drawingml/2006/picture">
-            <wp:extent cx="3200400" cy="6934200"/>
-            <wp:docPr id="1" name="Picture 1"/>
-            <wp:cNvGraphicFramePr>
-              <a:graphicFrameLocks noChangeAspect="1"/>
-            </wp:cNvGraphicFramePr>
-            <a:graphic>
-              <a:graphicData uri="http://schemas.openxmlformats.org/drawingml/2006/picture">
-                <pic:pic>
-                  <pic:nvPicPr>
-                    <pic:cNvPr id="0" name="01_empty_state.png"/>
-                    <pic:cNvPicPr/>
-                  </pic:nvPicPr>
-                  <pic:blipFill>
-                    <a:blip r:embed="rId9"/>
-                    <a:stretch>
-                      <a:fillRect/>
-                    </a:stretch>
-                  </pic:blipFill>
-                  <pic:spPr>
-                    <a:xfrm>
-                      <a:off x="0" y="0"/>
-                      <a:ext cx="3200400" cy="6934200"/>
-                    </a:xfrm>
-                    <a:prstGeom prst="rect"/>
-                  </pic:spPr>
-                </pic:pic>
-              </a:graphicData>
-            </a:graphic>
-          </wp:inline>
-        </w:drawing>
+        <w:rPr>
+          <w:rFonts w:ascii="宋体" w:hAnsi="宋体" w:eastAsia="宋体"/>
+          <w:b w:val="0"/>
+          <w:sz w:val="24"/>
+        </w:rPr>
+        <w:t>图 1：应用启动主界面（空状态）</w:t>
       </w:r>
     </w:p>
     <w:p>
-      <w:pPr>
-        <w:jc w:val="center"/>
-      </w:pPr>
       <w:r>
-        <w:rPr>
-          <w:i/>
-          <w:sz w:val="20"/>
-        </w:rPr>
-        <w:t>图：应用启动空状态界面</w:t>
+        <w:br w:type="page"/>
       </w:r>
     </w:p>
     <w:p>
@@ -473,7 +483,7 @@
       </w:pPr>
       <w:r>
         <w:rPr>
-          <w:color w:val="000000"/>
+          <w:color w:val="006B5E"/>
         </w:rPr>
         <w:t>3. 设计思路</w:t>
       </w:r>
@@ -484,27 +494,31 @@
       </w:pPr>
       <w:r>
         <w:rPr>
-          <w:color w:val="000000"/>
+          <w:color w:val="006B5E"/>
         </w:rPr>
         <w:t>3.1 技术选型</w:t>
       </w:r>
     </w:p>
     <w:tbl>
       <w:tblPr>
-        <w:tblStyle w:val="TableGrid"/>
+        <w:tblStyle w:val="LightGrid-Accent1"/>
         <w:tblW w:type="auto" w:w="0"/>
+        <w:jc w:val="center"/>
         <w:tblLook w:firstColumn="1" w:firstRow="1" w:lastColumn="0" w:lastRow="0" w:noHBand="0" w:noVBand="1" w:val="04A0"/>
       </w:tblPr>
       <w:tblGrid>
-        <w:gridCol w:w="4323"/>
-        <w:gridCol w:w="4323"/>
+        <w:gridCol w:w="4320"/>
+        <w:gridCol w:w="4320"/>
       </w:tblGrid>
       <w:tr>
         <w:tc>
           <w:tcPr>
-            <w:tcW w:type="dxa" w:w="4323"/>
+            <w:tcW w:type="dxa" w:w="4320"/>
           </w:tcPr>
           <w:p>
+            <w:pPr>
+              <w:jc w:val="center"/>
+            </w:pPr>
             <w:r>
               <w:rPr>
                 <w:b/>
@@ -515,9 +529,12 @@
         </w:tc>
         <w:tc>
           <w:tcPr>
-            <w:tcW w:type="dxa" w:w="4323"/>
+            <w:tcW w:type="dxa" w:w="4320"/>
           </w:tcPr>
           <w:p>
+            <w:pPr>
+              <w:jc w:val="center"/>
+            </w:pPr>
             <w:r>
               <w:rPr>
                 <w:b/>
@@ -530,7 +547,7 @@
       <w:tr>
         <w:tc>
           <w:tcPr>
-            <w:tcW w:type="dxa" w:w="4323"/>
+            <w:tcW w:type="dxa" w:w="4320"/>
           </w:tcPr>
           <w:p>
             <w:r>
@@ -540,7 +557,7 @@
         </w:tc>
         <w:tc>
           <w:tcPr>
-            <w:tcW w:type="dxa" w:w="4323"/>
+            <w:tcW w:type="dxa" w:w="4320"/>
           </w:tcPr>
           <w:p>
             <w:r>
@@ -552,7 +569,7 @@
       <w:tr>
         <w:tc>
           <w:tcPr>
-            <w:tcW w:type="dxa" w:w="4323"/>
+            <w:tcW w:type="dxa" w:w="4320"/>
           </w:tcPr>
           <w:p>
             <w:r>
@@ -562,7 +579,7 @@
         </w:tc>
         <w:tc>
           <w:tcPr>
-            <w:tcW w:type="dxa" w:w="4323"/>
+            <w:tcW w:type="dxa" w:w="4320"/>
           </w:tcPr>
           <w:p>
             <w:r>
@@ -574,21 +591,21 @@
       <w:tr>
         <w:tc>
           <w:tcPr>
-            <w:tcW w:type="dxa" w:w="4323"/>
+            <w:tcW w:type="dxa" w:w="4320"/>
           </w:tcPr>
           <w:p>
             <w:r>
-              <w:t>UI框架</w:t>
+              <w:t>UI 框架</w:t>
             </w:r>
           </w:p>
         </w:tc>
         <w:tc>
           <w:tcPr>
-            <w:tcW w:type="dxa" w:w="4323"/>
+            <w:tcW w:type="dxa" w:w="4320"/>
           </w:tcPr>
           <w:p>
             <w:r>
-              <w:t>Material Components + ConstraintLayout</w:t>
+              <w:t>Material Design 3（Material You）+ ConstraintLayout</w:t>
             </w:r>
           </w:p>
         </w:tc>
@@ -596,7 +613,7 @@
       <w:tr>
         <w:tc>
           <w:tcPr>
-            <w:tcW w:type="dxa" w:w="4323"/>
+            <w:tcW w:type="dxa" w:w="4320"/>
           </w:tcPr>
           <w:p>
             <w:r>
@@ -606,11 +623,11 @@
         </w:tc>
         <w:tc>
           <w:tcPr>
-            <w:tcW w:type="dxa" w:w="4323"/>
+            <w:tcW w:type="dxa" w:w="4320"/>
           </w:tcPr>
           <w:p>
             <w:r>
-              <w:t>RecyclerView + CardView</w:t>
+              <w:t>RecyclerView + MaterialCardView</w:t>
             </w:r>
           </w:p>
         </w:tc>
@@ -618,7 +635,29 @@
       <w:tr>
         <w:tc>
           <w:tcPr>
-            <w:tcW w:type="dxa" w:w="4323"/>
+            <w:tcW w:type="dxa" w:w="4320"/>
+          </w:tcPr>
+          <w:p>
+            <w:r>
+              <w:t>主题色</w:t>
+            </w:r>
+          </w:p>
+        </w:tc>
+        <w:tc>
+          <w:tcPr>
+            <w:tcW w:type="dxa" w:w="4320"/>
+          </w:tcPr>
+          <w:p>
+            <w:r>
+              <w:t>深松绿（Teal）主色 #006B5E，暖白背景 #FFFBF8</w:t>
+            </w:r>
+          </w:p>
+        </w:tc>
+      </w:tr>
+      <w:tr>
+        <w:tc>
+          <w:tcPr>
+            <w:tcW w:type="dxa" w:w="4320"/>
           </w:tcPr>
           <w:p>
             <w:r>
@@ -628,7 +667,7 @@
         </w:tc>
         <w:tc>
           <w:tcPr>
-            <w:tcW w:type="dxa" w:w="4323"/>
+            <w:tcW w:type="dxa" w:w="4320"/>
           </w:tcPr>
           <w:p>
             <w:r>
@@ -644,29 +683,33 @@
       </w:pPr>
       <w:r>
         <w:rPr>
-          <w:color w:val="000000"/>
+          <w:color w:val="006B5E"/>
         </w:rPr>
         <w:t>3.2 数据库设计</w:t>
       </w:r>
     </w:p>
     <w:tbl>
       <w:tblPr>
-        <w:tblStyle w:val="TableGrid"/>
+        <w:tblStyle w:val="LightGrid-Accent1"/>
         <w:tblW w:type="auto" w:w="0"/>
+        <w:jc w:val="center"/>
         <w:tblLook w:firstColumn="1" w:firstRow="1" w:lastColumn="0" w:lastRow="0" w:noHBand="0" w:noVBand="1" w:val="04A0"/>
       </w:tblPr>
       <w:tblGrid>
-        <w:gridCol w:w="2161"/>
-        <w:gridCol w:w="2161"/>
-        <w:gridCol w:w="2161"/>
-        <w:gridCol w:w="2161"/>
+        <w:gridCol w:w="2160"/>
+        <w:gridCol w:w="2160"/>
+        <w:gridCol w:w="2160"/>
+        <w:gridCol w:w="2160"/>
       </w:tblGrid>
       <w:tr>
         <w:tc>
           <w:tcPr>
-            <w:tcW w:type="dxa" w:w="2161"/>
+            <w:tcW w:type="dxa" w:w="2160"/>
           </w:tcPr>
           <w:p>
+            <w:pPr>
+              <w:jc w:val="center"/>
+            </w:pPr>
             <w:r>
               <w:rPr>
                 <w:b/>
@@ -677,9 +720,12 @@
         </w:tc>
         <w:tc>
           <w:tcPr>
-            <w:tcW w:type="dxa" w:w="2161"/>
+            <w:tcW w:type="dxa" w:w="2160"/>
           </w:tcPr>
           <w:p>
+            <w:pPr>
+              <w:jc w:val="center"/>
+            </w:pPr>
             <w:r>
               <w:rPr>
                 <w:b/>
@@ -690,9 +736,12 @@
         </w:tc>
         <w:tc>
           <w:tcPr>
-            <w:tcW w:type="dxa" w:w="2161"/>
+            <w:tcW w:type="dxa" w:w="2160"/>
           </w:tcPr>
           <w:p>
+            <w:pPr>
+              <w:jc w:val="center"/>
+            </w:pPr>
             <w:r>
               <w:rPr>
                 <w:b/>
@@ -703,9 +752,12 @@
         </w:tc>
         <w:tc>
           <w:tcPr>
-            <w:tcW w:type="dxa" w:w="2161"/>
+            <w:tcW w:type="dxa" w:w="2160"/>
           </w:tcPr>
           <w:p>
+            <w:pPr>
+              <w:jc w:val="center"/>
+            </w:pPr>
             <w:r>
               <w:rPr>
                 <w:b/>
@@ -718,7 +770,7 @@
       <w:tr>
         <w:tc>
           <w:tcPr>
-            <w:tcW w:type="dxa" w:w="2161"/>
+            <w:tcW w:type="dxa" w:w="2160"/>
           </w:tcPr>
           <w:p>
             <w:r>
@@ -728,7 +780,7 @@
         </w:tc>
         <w:tc>
           <w:tcPr>
-            <w:tcW w:type="dxa" w:w="2161"/>
+            <w:tcW w:type="dxa" w:w="2160"/>
           </w:tcPr>
           <w:p>
             <w:r>
@@ -738,7 +790,7 @@
         </w:tc>
         <w:tc>
           <w:tcPr>
-            <w:tcW w:type="dxa" w:w="2161"/>
+            <w:tcW w:type="dxa" w:w="2160"/>
           </w:tcPr>
           <w:p>
             <w:r>
@@ -748,7 +800,7 @@
         </w:tc>
         <w:tc>
           <w:tcPr>
-            <w:tcW w:type="dxa" w:w="2161"/>
+            <w:tcW w:type="dxa" w:w="2160"/>
           </w:tcPr>
           <w:p>
             <w:r>
@@ -760,7 +812,7 @@
       <w:tr>
         <w:tc>
           <w:tcPr>
-            <w:tcW w:type="dxa" w:w="2161"/>
+            <w:tcW w:type="dxa" w:w="2160"/>
           </w:tcPr>
           <w:p>
             <w:r>
@@ -770,7 +822,7 @@
         </w:tc>
         <w:tc>
           <w:tcPr>
-            <w:tcW w:type="dxa" w:w="2161"/>
+            <w:tcW w:type="dxa" w:w="2160"/>
           </w:tcPr>
           <w:p>
             <w:r>
@@ -780,7 +832,7 @@
         </w:tc>
         <w:tc>
           <w:tcPr>
-            <w:tcW w:type="dxa" w:w="2161"/>
+            <w:tcW w:type="dxa" w:w="2160"/>
           </w:tcPr>
           <w:p>
             <w:r>
@@ -790,7 +842,7 @@
         </w:tc>
         <w:tc>
           <w:tcPr>
-            <w:tcW w:type="dxa" w:w="2161"/>
+            <w:tcW w:type="dxa" w:w="2160"/>
           </w:tcPr>
           <w:p>
             <w:r>
@@ -802,7 +854,7 @@
       <w:tr>
         <w:tc>
           <w:tcPr>
-            <w:tcW w:type="dxa" w:w="2161"/>
+            <w:tcW w:type="dxa" w:w="2160"/>
           </w:tcPr>
           <w:p>
             <w:r>
@@ -812,7 +864,7 @@
         </w:tc>
         <w:tc>
           <w:tcPr>
-            <w:tcW w:type="dxa" w:w="2161"/>
+            <w:tcW w:type="dxa" w:w="2160"/>
           </w:tcPr>
           <w:p>
             <w:r>
@@ -822,7 +874,7 @@
         </w:tc>
         <w:tc>
           <w:tcPr>
-            <w:tcW w:type="dxa" w:w="2161"/>
+            <w:tcW w:type="dxa" w:w="2160"/>
           </w:tcPr>
           <w:p>
             <w:r/>
@@ -830,7 +882,7 @@
         </w:tc>
         <w:tc>
           <w:tcPr>
-            <w:tcW w:type="dxa" w:w="2161"/>
+            <w:tcW w:type="dxa" w:w="2160"/>
           </w:tcPr>
           <w:p>
             <w:r>
@@ -842,7 +894,7 @@
       <w:tr>
         <w:tc>
           <w:tcPr>
-            <w:tcW w:type="dxa" w:w="2161"/>
+            <w:tcW w:type="dxa" w:w="2160"/>
           </w:tcPr>
           <w:p>
             <w:r>
@@ -852,7 +904,7 @@
         </w:tc>
         <w:tc>
           <w:tcPr>
-            <w:tcW w:type="dxa" w:w="2161"/>
+            <w:tcW w:type="dxa" w:w="2160"/>
           </w:tcPr>
           <w:p>
             <w:r>
@@ -862,7 +914,7 @@
         </w:tc>
         <w:tc>
           <w:tcPr>
-            <w:tcW w:type="dxa" w:w="2161"/>
+            <w:tcW w:type="dxa" w:w="2160"/>
           </w:tcPr>
           <w:p>
             <w:r>
@@ -872,7 +924,7 @@
         </w:tc>
         <w:tc>
           <w:tcPr>
-            <w:tcW w:type="dxa" w:w="2161"/>
+            <w:tcW w:type="dxa" w:w="2160"/>
           </w:tcPr>
           <w:p>
             <w:r>
@@ -884,7 +936,7 @@
       <w:tr>
         <w:tc>
           <w:tcPr>
-            <w:tcW w:type="dxa" w:w="2161"/>
+            <w:tcW w:type="dxa" w:w="2160"/>
           </w:tcPr>
           <w:p>
             <w:r>
@@ -894,7 +946,7 @@
         </w:tc>
         <w:tc>
           <w:tcPr>
-            <w:tcW w:type="dxa" w:w="2161"/>
+            <w:tcW w:type="dxa" w:w="2160"/>
           </w:tcPr>
           <w:p>
             <w:r>
@@ -904,7 +956,7 @@
         </w:tc>
         <w:tc>
           <w:tcPr>
-            <w:tcW w:type="dxa" w:w="2161"/>
+            <w:tcW w:type="dxa" w:w="2160"/>
           </w:tcPr>
           <w:p>
             <w:r>
@@ -914,7 +966,7 @@
         </w:tc>
         <w:tc>
           <w:tcPr>
-            <w:tcW w:type="dxa" w:w="2161"/>
+            <w:tcW w:type="dxa" w:w="2160"/>
           </w:tcPr>
           <w:p>
             <w:r>
@@ -926,7 +978,7 @@
       <w:tr>
         <w:tc>
           <w:tcPr>
-            <w:tcW w:type="dxa" w:w="2161"/>
+            <w:tcW w:type="dxa" w:w="2160"/>
           </w:tcPr>
           <w:p>
             <w:r>
@@ -936,7 +988,7 @@
         </w:tc>
         <w:tc>
           <w:tcPr>
-            <w:tcW w:type="dxa" w:w="2161"/>
+            <w:tcW w:type="dxa" w:w="2160"/>
           </w:tcPr>
           <w:p>
             <w:r>
@@ -946,7 +998,7 @@
         </w:tc>
         <w:tc>
           <w:tcPr>
-            <w:tcW w:type="dxa" w:w="2161"/>
+            <w:tcW w:type="dxa" w:w="2160"/>
           </w:tcPr>
           <w:p>
             <w:r>
@@ -956,11 +1008,11 @@
         </w:tc>
         <w:tc>
           <w:tcPr>
-            <w:tcW w:type="dxa" w:w="2161"/>
+            <w:tcW w:type="dxa" w:w="2160"/>
           </w:tcPr>
           <w:p>
             <w:r>
-              <w:t>完成状态</w:t>
+              <w:t>完成状态 0/1</w:t>
             </w:r>
           </w:p>
         </w:tc>
@@ -968,37 +1020,164 @@
     </w:tbl>
     <w:p>
       <w:pPr>
+        <w:spacing w:after="120"/>
+      </w:pPr>
+      <w:r>
+        <w:rPr>
+          <w:rFonts w:ascii="宋体" w:hAnsi="宋体" w:eastAsia="宋体"/>
+          <w:b w:val="0"/>
+          <w:sz w:val="24"/>
+        </w:rPr>
+        <w:t>建表 SQL：</w:t>
+      </w:r>
+    </w:p>
+    <w:p>
+      <w:pPr>
+        <w:spacing w:after="120"/>
+      </w:pPr>
+      <w:r>
+        <w:rPr>
+          <w:rFonts w:ascii="宋体" w:hAnsi="宋体" w:eastAsia="宋体"/>
+          <w:b w:val="0"/>
+          <w:sz w:val="24"/>
+        </w:rPr>
+        <w:t>CREATE TABLE todos (id INTEGER PRIMARY KEY AUTOINCREMENT, title TEXT NOT NULL, content TEXT, created_at INTEGER NOT NULL, updated_at INTEGER NOT NULL, is_completed INTEGER DEFAULT 0)</w:t>
+      </w:r>
+    </w:p>
+    <w:p>
+      <w:pPr>
         <w:pStyle w:val="Heading2"/>
       </w:pPr>
       <w:r>
         <w:rPr>
-          <w:color w:val="000000"/>
+          <w:color w:val="006B5E"/>
         </w:rPr>
-        <w:t>3.3 架构设计</w:t>
+        <w:t>3.3 界面设计</w:t>
       </w:r>
     </w:p>
     <w:p>
+      <w:pPr>
+        <w:spacing w:after="120"/>
+      </w:pPr>
       <w:r>
-        <w:t>采用 MVC（Model-View-Controller）架构：</w:t>
+        <w:rPr>
+          <w:rFonts w:ascii="宋体" w:hAnsi="宋体" w:eastAsia="宋体"/>
+          <w:b w:val="0"/>
+          <w:sz w:val="24"/>
+        </w:rPr>
+        <w:t>应用采用 Material Design 3 设计语言，整体风格现代清爽：</w:t>
+      </w:r>
+    </w:p>
+    <w:p>
+      <w:pPr>
+        <w:spacing w:after="120"/>
+      </w:pPr>
+      <w:r>
+        <w:rPr>
+          <w:rFonts w:ascii="宋体" w:hAnsi="宋体" w:eastAsia="宋体"/>
+          <w:b w:val="0"/>
+          <w:sz w:val="24"/>
+        </w:rPr>
+        <w:t>• 主色调：深松绿（Teal）色系，primary = #006B5E，渐变头从 #006B5E 过渡到 #009688</w:t>
+      </w:r>
+    </w:p>
+    <w:p>
+      <w:pPr>
+        <w:spacing w:after="120"/>
+      </w:pPr>
+      <w:r>
+        <w:rPr>
+          <w:rFonts w:ascii="宋体" w:hAnsi="宋体" w:eastAsia="宋体"/>
+          <w:b w:val="0"/>
+          <w:sz w:val="24"/>
+        </w:rPr>
+        <w:t>• 背景：暖白 #FFFBF8，卡片纯白 #FFFFFF</w:t>
+      </w:r>
+    </w:p>
+    <w:p>
+      <w:pPr>
+        <w:spacing w:after="120"/>
+      </w:pPr>
+      <w:r>
+        <w:rPr>
+          <w:rFonts w:ascii="宋体" w:hAnsi="宋体" w:eastAsia="宋体"/>
+          <w:b w:val="0"/>
+          <w:sz w:val="24"/>
+        </w:rPr>
+        <w:t>• 布局风格：浅色背景 + 白色圆角卡片（圆角 14~16dp）+ 顶部渐变条，无 ActionBar</w:t>
+      </w:r>
+    </w:p>
+    <w:p>
+      <w:pPr>
+        <w:spacing w:after="120"/>
+      </w:pPr>
+      <w:r>
+        <w:rPr>
+          <w:rFonts w:ascii="宋体" w:hAnsi="宋体" w:eastAsia="宋体"/>
+          <w:b w:val="0"/>
+          <w:sz w:val="24"/>
+        </w:rPr>
+        <w:t>• 列表：MaterialCardView 列表项，圆角 14dp，2dp 阴影，左侧状态圆点</w:t>
+      </w:r>
+    </w:p>
+    <w:p>
+      <w:pPr>
+        <w:spacing w:after="120"/>
+      </w:pPr>
+      <w:r>
+        <w:rPr>
+          <w:rFonts w:ascii="宋体" w:hAnsi="宋体" w:eastAsia="宋体"/>
+          <w:b w:val="0"/>
+          <w:sz w:val="24"/>
+        </w:rPr>
+        <w:t>• 按钮：ExtendedFloatingActionButton（主色底），TonalButton（状态切换），红色删除按钮（#BA1A1A）</w:t>
+      </w:r>
+    </w:p>
+    <w:p>
+      <w:pPr>
+        <w:pStyle w:val="Heading2"/>
+      </w:pPr>
+      <w:r>
+        <w:rPr>
+          <w:color w:val="006B5E"/>
+        </w:rPr>
+        <w:t>3.4 架构设计</w:t>
+      </w:r>
+    </w:p>
+    <w:p>
+      <w:pPr>
+        <w:spacing w:after="120"/>
+      </w:pPr>
+      <w:r>
+        <w:rPr>
+          <w:rFonts w:ascii="宋体" w:hAnsi="宋体" w:eastAsia="宋体"/>
+          <w:b w:val="0"/>
+          <w:sz w:val="24"/>
+        </w:rPr>
+        <w:t>采用 MVC（Model-View-Controller）架构，各 Activity 职责明确：</w:t>
       </w:r>
     </w:p>
     <w:tbl>
       <w:tblPr>
-        <w:tblStyle w:val="TableGrid"/>
+        <w:tblStyle w:val="LightGrid-Accent1"/>
         <w:tblW w:type="auto" w:w="0"/>
+        <w:jc w:val="center"/>
         <w:tblLook w:firstColumn="1" w:firstRow="1" w:lastColumn="0" w:lastRow="0" w:noHBand="0" w:noVBand="1" w:val="04A0"/>
       </w:tblPr>
       <w:tblGrid>
-        <w:gridCol w:w="2882"/>
-        <w:gridCol w:w="2882"/>
-        <w:gridCol w:w="2882"/>
+        <w:gridCol w:w="2880"/>
+        <w:gridCol w:w="2880"/>
+        <w:gridCol w:w="2880"/>
       </w:tblGrid>
       <w:tr>
         <w:tc>
           <w:tcPr>
-            <w:tcW w:type="dxa" w:w="2882"/>
+            <w:tcW w:type="dxa" w:w="2880"/>
           </w:tcPr>
           <w:p>
+            <w:pPr>
+              <w:jc w:val="center"/>
+            </w:pPr>
             <w:r>
               <w:rPr>
                 <w:b/>
@@ -1009,9 +1188,12 @@
         </w:tc>
         <w:tc>
           <w:tcPr>
-            <w:tcW w:type="dxa" w:w="2882"/>
+            <w:tcW w:type="dxa" w:w="2880"/>
           </w:tcPr>
           <w:p>
+            <w:pPr>
+              <w:jc w:val="center"/>
+            </w:pPr>
             <w:r>
               <w:rPr>
                 <w:b/>
@@ -1022,9 +1204,12 @@
         </w:tc>
         <w:tc>
           <w:tcPr>
-            <w:tcW w:type="dxa" w:w="2882"/>
+            <w:tcW w:type="dxa" w:w="2880"/>
           </w:tcPr>
           <w:p>
+            <w:pPr>
+              <w:jc w:val="center"/>
+            </w:pPr>
             <w:r>
               <w:rPr>
                 <w:b/>
@@ -1037,7 +1222,7 @@
       <w:tr>
         <w:tc>
           <w:tcPr>
-            <w:tcW w:type="dxa" w:w="2882"/>
+            <w:tcW w:type="dxa" w:w="2880"/>
           </w:tcPr>
           <w:p>
             <w:r>
@@ -1047,7 +1232,7 @@
         </w:tc>
         <w:tc>
           <w:tcPr>
-            <w:tcW w:type="dxa" w:w="2882"/>
+            <w:tcW w:type="dxa" w:w="2880"/>
           </w:tcPr>
           <w:p>
             <w:r>
@@ -1057,7 +1242,7 @@
         </w:tc>
         <w:tc>
           <w:tcPr>
-            <w:tcW w:type="dxa" w:w="2882"/>
+            <w:tcW w:type="dxa" w:w="2880"/>
           </w:tcPr>
           <w:p>
             <w:r>
@@ -1069,7 +1254,7 @@
       <w:tr>
         <w:tc>
           <w:tcPr>
-            <w:tcW w:type="dxa" w:w="2882"/>
+            <w:tcW w:type="dxa" w:w="2880"/>
           </w:tcPr>
           <w:p>
             <w:r>
@@ -1079,17 +1264,17 @@
         </w:tc>
         <w:tc>
           <w:tcPr>
-            <w:tcW w:type="dxa" w:w="2882"/>
+            <w:tcW w:type="dxa" w:w="2880"/>
           </w:tcPr>
           <w:p>
             <w:r>
-              <w:t>新增/编辑待办</w:t>
+              <w:t>新增 / 编辑待办</w:t>
             </w:r>
           </w:p>
         </w:tc>
         <w:tc>
           <w:tcPr>
-            <w:tcW w:type="dxa" w:w="2882"/>
+            <w:tcW w:type="dxa" w:w="2880"/>
           </w:tcPr>
           <w:p>
             <w:r>
@@ -1101,7 +1286,7 @@
       <w:tr>
         <w:tc>
           <w:tcPr>
-            <w:tcW w:type="dxa" w:w="2882"/>
+            <w:tcW w:type="dxa" w:w="2880"/>
           </w:tcPr>
           <w:p>
             <w:r>
@@ -1111,7 +1296,7 @@
         </w:tc>
         <w:tc>
           <w:tcPr>
-            <w:tcW w:type="dxa" w:w="2882"/>
+            <w:tcW w:type="dxa" w:w="2880"/>
           </w:tcPr>
           <w:p>
             <w:r>
@@ -1121,7 +1306,7 @@
         </w:tc>
         <w:tc>
           <w:tcPr>
-            <w:tcW w:type="dxa" w:w="2882"/>
+            <w:tcW w:type="dxa" w:w="2880"/>
           </w:tcPr>
           <w:p>
             <w:r>
@@ -1132,12 +1317,17 @@
       </w:tr>
     </w:tbl>
     <w:p>
+      <w:r>
+        <w:br w:type="page"/>
+      </w:r>
+    </w:p>
+    <w:p>
       <w:pPr>
         <w:pStyle w:val="Heading1"/>
       </w:pPr>
       <w:r>
         <w:rPr>
-          <w:color w:val="000000"/>
+          <w:color w:val="006B5E"/>
         </w:rPr>
         <w:t>4. 功能实现步骤</w:t>
       </w:r>
@@ -1148,13 +1338,21 @@
       </w:pPr>
       <w:r>
         <w:rPr>
-          <w:color w:val="000000"/>
+          <w:color w:val="006B5E"/>
         </w:rPr>
         <w:t>4.1 数据模型层（Todo.java）</w:t>
       </w:r>
     </w:p>
     <w:p>
+      <w:pPr>
+        <w:spacing w:after="120"/>
+      </w:pPr>
       <w:r>
+        <w:rPr>
+          <w:rFonts w:ascii="宋体" w:hAnsi="宋体" w:eastAsia="宋体"/>
+          <w:b w:val="0"/>
+          <w:sz w:val="24"/>
+        </w:rPr>
         <w:t>封装待办事项的各个属性，提供无参和带参构造函数。无参构造自动设置时间戳和未完成状态。</w:t>
       </w:r>
     </w:p>
@@ -1164,42 +1362,22 @@
       </w:pPr>
       <w:r>
         <w:rPr>
-          <w:color w:val="000000"/>
+          <w:color w:val="006B5E"/>
         </w:rPr>
         <w:t>4.2 数据库层（TodoDatabaseHelper.java）</w:t>
       </w:r>
     </w:p>
     <w:p>
-      <w:r>
-        <w:t>继承 SQLiteOpenHelper，在 onCreate 中执行建表语句。封装 insert、update、delete、getById、getAllCursor 五个核心方法。</w:t>
-      </w:r>
-    </w:p>
-    <w:p>
       <w:pPr>
-        <w:ind w:left="567"/>
+        <w:spacing w:after="120"/>
       </w:pPr>
       <w:r>
         <w:rPr>
-          <w:rFonts w:ascii="Courier New" w:hAnsi="Courier New"/>
-          <w:sz w:val="18"/>
+          <w:rFonts w:ascii="宋体" w:hAnsi="宋体" w:eastAsia="宋体"/>
+          <w:b w:val="0"/>
+          <w:sz w:val="24"/>
         </w:rPr>
-        <w:t>// 建表SQL</w:t>
-        <w:br/>
-        <w:t>CREATE TABLE todos (</w:t>
-        <w:br/>
-        <w:t xml:space="preserve">  id INTEGER PRIMARY KEY AUTOINCREMENT,</w:t>
-        <w:br/>
-        <w:t xml:space="preserve">  title TEXT NOT NULL,</w:t>
-        <w:br/>
-        <w:t xml:space="preserve">  content TEXT,</w:t>
-        <w:br/>
-        <w:t xml:space="preserve">  created_at INTEGER NOT NULL,</w:t>
-        <w:br/>
-        <w:t xml:space="preserve">  updated_at INTEGER NOT NULL,</w:t>
-        <w:br/>
-        <w:t xml:space="preserve">  is_completed INTEGER DEFAULT 0</w:t>
-        <w:br/>
-        <w:t>)</w:t>
+        <w:t>继承 SQLiteOpenHelper，在 onCreate 中执行建表语句。封装 insert、update、delete、getById、getAllCursor 五个核心方法。</w:t>
       </w:r>
     </w:p>
     <w:p>
@@ -1208,65 +1386,35 @@
       </w:pPr>
       <w:r>
         <w:rPr>
-          <w:color w:val="000000"/>
+          <w:color w:val="006B5E"/>
         </w:rPr>
         <w:t>4.3 适配器层（TodoAdapter.java）</w:t>
       </w:r>
     </w:p>
     <w:p>
+      <w:pPr>
+        <w:spacing w:after="120"/>
+      </w:pPr>
       <w:r>
+        <w:rPr>
+          <w:rFonts w:ascii="宋体" w:hAnsi="宋体" w:eastAsia="宋体"/>
+          <w:b w:val="0"/>
+          <w:sz w:val="24"/>
+        </w:rPr>
         <w:t>TodoAdapter 继承 RecyclerView.Adapter，接收 Cursor 数据源。通过 swapCursor 方法实现数据刷新，避免重新创建 Adapter。提供 OnItemClickListener 回调。</w:t>
       </w:r>
     </w:p>
     <w:p>
       <w:pPr>
-        <w:jc w:val="center"/>
-      </w:pPr>
-      <w:r>
-        <w:drawing>
-          <wp:inline xmlns:a="http://schemas.openxmlformats.org/drawingml/2006/main" xmlns:pic="http://schemas.openxmlformats.org/drawingml/2006/picture">
-            <wp:extent cx="3200400" cy="6934200"/>
-            <wp:docPr id="2" name="Picture 2"/>
-            <wp:cNvGraphicFramePr>
-              <a:graphicFrameLocks noChangeAspect="1"/>
-            </wp:cNvGraphicFramePr>
-            <a:graphic>
-              <a:graphicData uri="http://schemas.openxmlformats.org/drawingml/2006/picture">
-                <pic:pic>
-                  <pic:nvPicPr>
-                    <pic:cNvPr id="0" name="03_todo_list.png"/>
-                    <pic:cNvPicPr/>
-                  </pic:nvPicPr>
-                  <pic:blipFill>
-                    <a:blip r:embed="rId10"/>
-                    <a:stretch>
-                      <a:fillRect/>
-                    </a:stretch>
-                  </pic:blipFill>
-                  <pic:spPr>
-                    <a:xfrm>
-                      <a:off x="0" y="0"/>
-                      <a:ext cx="3200400" cy="6934200"/>
-                    </a:xfrm>
-                    <a:prstGeom prst="rect"/>
-                  </pic:spPr>
-                </pic:pic>
-              </a:graphicData>
-            </a:graphic>
-          </wp:inline>
-        </w:drawing>
-      </w:r>
-    </w:p>
-    <w:p>
-      <w:pPr>
-        <w:jc w:val="center"/>
+        <w:spacing w:after="120"/>
       </w:pPr>
       <w:r>
         <w:rPr>
-          <w:i/>
-          <w:sz w:val="20"/>
+          <w:rFonts w:ascii="宋体" w:hAnsi="宋体" w:eastAsia="宋体"/>
+          <w:b w:val="0"/>
+          <w:sz w:val="24"/>
         </w:rPr>
-        <w:t>图：待办列表界面（MaterialCardView 卡片样式）</w:t>
+        <w:t>图 2：待办列表界面（MaterialCardView 卡片样式，Teal 渐变顶栏）</w:t>
       </w:r>
     </w:p>
     <w:p>
@@ -1275,14 +1423,35 @@
       </w:pPr>
       <w:r>
         <w:rPr>
-          <w:color w:val="000000"/>
+          <w:color w:val="006B5E"/>
         </w:rPr>
         <w:t>4.4 主界面（MainActivity.java）</w:t>
       </w:r>
     </w:p>
     <w:p>
+      <w:pPr>
+        <w:spacing w:after="120"/>
+      </w:pPr>
       <w:r>
-        <w:t>启动入口 Activity，加载待办列表。使用 RecyclerView 展示数据，FloatingActionButton 作为新建按钮。通过 startActivityForResult 跳转后，在 onResume 中刷新列表。数据库为空时显示提示文字。</w:t>
+        <w:rPr>
+          <w:rFonts w:ascii="宋体" w:hAnsi="宋体" w:eastAsia="宋体"/>
+          <w:b w:val="0"/>
+          <w:sz w:val="24"/>
+        </w:rPr>
+        <w:t>启动入口 Activity，加载待办列表。140dp 渐变顶部区域，显示"我的待办"大标题及"今天也要加油哦 ✨"副标题。使用 RecyclerView 展示数据（LinearLayoutManager，四边 16dp padding），ExtendedFloatingActionButton 作为新建按钮。列表为空时显示居中空状态图标及提示文字。</w:t>
+      </w:r>
+    </w:p>
+    <w:p>
+      <w:pPr>
+        <w:spacing w:after="120"/>
+      </w:pPr>
+      <w:r>
+        <w:rPr>
+          <w:rFonts w:ascii="宋体" w:hAnsi="宋体" w:eastAsia="宋体"/>
+          <w:b w:val="0"/>
+          <w:sz w:val="24"/>
+        </w:rPr>
+        <w:t>图 3：待办列表主界面</w:t>
       </w:r>
     </w:p>
     <w:p>
@@ -1291,116 +1460,35 @@
       </w:pPr>
       <w:r>
         <w:rPr>
-          <w:color w:val="000000"/>
+          <w:color w:val="006B5E"/>
         </w:rPr>
         <w:t>4.5 新增编辑（AddEditTodoActivity.java）</w:t>
       </w:r>
     </w:p>
     <w:p>
+      <w:pPr>
+        <w:spacing w:after="120"/>
+      </w:pPr>
       <w:r>
-        <w:t>新增和编辑共用同一 Activity，通过 Intent 中的 todo_id 进行区分（-1 为新增，其他为编辑）。提供标题非空校验，保存成功后设置 RESULT_OK 返回。</w:t>
+        <w:rPr>
+          <w:rFonts w:ascii="宋体" w:hAnsi="宋体" w:eastAsia="宋体"/>
+          <w:b w:val="0"/>
+          <w:sz w:val="24"/>
+        </w:rPr>
+        <w:t>新增和编辑共用同一 Activity，通过 Intent 中的 todo_id 区分（-1 为新增，其他为编辑）。120dp 渐变顶部，MaterialCardView 包裹表单（圆角 16dp，3dp 阴影）。标题和内容使用 TextInputLayout（OutlinedBox 风格）。保存按钮为满宽 MaterialButton（圆角 14dp，暗绿色底 + 白色粗体字）。</w:t>
       </w:r>
     </w:p>
     <w:p>
       <w:pPr>
-        <w:jc w:val="center"/>
-      </w:pPr>
-      <w:r>
-        <w:drawing>
-          <wp:inline xmlns:a="http://schemas.openxmlformats.org/drawingml/2006/main" xmlns:pic="http://schemas.openxmlformats.org/drawingml/2006/picture">
-            <wp:extent cx="3200400" cy="6934200"/>
-            <wp:docPr id="3" name="Picture 3"/>
-            <wp:cNvGraphicFramePr>
-              <a:graphicFrameLocks noChangeAspect="1"/>
-            </wp:cNvGraphicFramePr>
-            <a:graphic>
-              <a:graphicData uri="http://schemas.openxmlformats.org/drawingml/2006/picture">
-                <pic:pic>
-                  <pic:nvPicPr>
-                    <pic:cNvPr id="0" name="02_add_todo.png"/>
-                    <pic:cNvPicPr/>
-                  </pic:nvPicPr>
-                  <pic:blipFill>
-                    <a:blip r:embed="rId11"/>
-                    <a:stretch>
-                      <a:fillRect/>
-                    </a:stretch>
-                  </pic:blipFill>
-                  <pic:spPr>
-                    <a:xfrm>
-                      <a:off x="0" y="0"/>
-                      <a:ext cx="3200400" cy="6934200"/>
-                    </a:xfrm>
-                    <a:prstGeom prst="rect"/>
-                  </pic:spPr>
-                </pic:pic>
-              </a:graphicData>
-            </a:graphic>
-          </wp:inline>
-        </w:drawing>
-      </w:r>
-    </w:p>
-    <w:p>
-      <w:pPr>
-        <w:jc w:val="center"/>
+        <w:spacing w:after="120"/>
       </w:pPr>
       <w:r>
         <w:rPr>
-          <w:i/>
-          <w:sz w:val="20"/>
+          <w:rFonts w:ascii="宋体" w:hAnsi="宋体" w:eastAsia="宋体"/>
+          <w:b w:val="0"/>
+          <w:sz w:val="24"/>
         </w:rPr>
-        <w:t>图：新增待办页面</w:t>
-      </w:r>
-    </w:p>
-    <w:p>
-      <w:pPr>
-        <w:jc w:val="center"/>
-      </w:pPr>
-      <w:r>
-        <w:drawing>
-          <wp:inline xmlns:a="http://schemas.openxmlformats.org/drawingml/2006/main" xmlns:pic="http://schemas.openxmlformats.org/drawingml/2006/picture">
-            <wp:extent cx="3200400" cy="6934200"/>
-            <wp:docPr id="4" name="Picture 4"/>
-            <wp:cNvGraphicFramePr>
-              <a:graphicFrameLocks noChangeAspect="1"/>
-            </wp:cNvGraphicFramePr>
-            <a:graphic>
-              <a:graphicData uri="http://schemas.openxmlformats.org/drawingml/2006/picture">
-                <pic:pic>
-                  <pic:nvPicPr>
-                    <pic:cNvPr id="0" name="05_edit_page.png"/>
-                    <pic:cNvPicPr/>
-                  </pic:nvPicPr>
-                  <pic:blipFill>
-                    <a:blip r:embed="rId12"/>
-                    <a:stretch>
-                      <a:fillRect/>
-                    </a:stretch>
-                  </pic:blipFill>
-                  <pic:spPr>
-                    <a:xfrm>
-                      <a:off x="0" y="0"/>
-                      <a:ext cx="3200400" cy="6934200"/>
-                    </a:xfrm>
-                    <a:prstGeom prst="rect"/>
-                  </pic:spPr>
-                </pic:pic>
-              </a:graphicData>
-            </a:graphic>
-          </wp:inline>
-        </w:drawing>
-      </w:r>
-    </w:p>
-    <w:p>
-      <w:pPr>
-        <w:jc w:val="center"/>
-      </w:pPr>
-      <w:r>
-        <w:rPr>
-          <w:i/>
-          <w:sz w:val="20"/>
-        </w:rPr>
-        <w:t>图：编辑待办页面</w:t>
+        <w:t>图 4：新增待办页面 ｜ 图 5：编辑待办页面</w:t>
       </w:r>
     </w:p>
     <w:p>
@@ -1409,167 +1497,40 @@
       </w:pPr>
       <w:r>
         <w:rPr>
-          <w:color w:val="000000"/>
+          <w:color w:val="006B5E"/>
         </w:rPr>
         <w:t>4.6 待办详情（TodoDetailActivity.java）</w:t>
       </w:r>
     </w:p>
     <w:p>
+      <w:pPr>
+        <w:spacing w:after="120"/>
+      </w:pPr>
       <w:r>
-        <w:t>详情页以 CardView 展示完整内容，底部提供状态切换和删除按钮。工具栏添加编辑按钮（Menu Item），删除操作弹出确认对话框。</w:t>
+        <w:rPr>
+          <w:rFonts w:ascii="宋体" w:hAnsi="宋体" w:eastAsia="宋体"/>
+          <w:b w:val="0"/>
+          <w:sz w:val="24"/>
+        </w:rPr>
+        <w:t>56dp 渐变工具栏，左返回箭头、居中标题、右编辑图标。内容区域为全高 MaterialCardView，含标题、状态徽章（完成=绿色 #006B5E，未完成=灰色 #9CA9A3）。底部操作栏含 TonalButton 状态切换按钮和红色删除按钮。删除操作弹出 AlertDialog 二次确认对话框。</w:t>
       </w:r>
     </w:p>
     <w:p>
       <w:pPr>
-        <w:jc w:val="center"/>
+        <w:spacing w:after="120"/>
       </w:pPr>
       <w:r>
-        <w:drawing>
-          <wp:inline xmlns:a="http://schemas.openxmlformats.org/drawingml/2006/main" xmlns:pic="http://schemas.openxmlformats.org/drawingml/2006/picture">
-            <wp:extent cx="3200400" cy="6934200"/>
-            <wp:docPr id="5" name="Picture 5"/>
-            <wp:cNvGraphicFramePr>
-              <a:graphicFrameLocks noChangeAspect="1"/>
-            </wp:cNvGraphicFramePr>
-            <a:graphic>
-              <a:graphicData uri="http://schemas.openxmlformats.org/drawingml/2006/picture">
-                <pic:pic>
-                  <pic:nvPicPr>
-                    <pic:cNvPr id="0" name="02_add_todo.png"/>
-                    <pic:cNvPicPr/>
-                  </pic:nvPicPr>
-                  <pic:blipFill>
-                    <a:blip r:embed="rId11"/>
-                    <a:stretch>
-                      <a:fillRect/>
-                    </a:stretch>
-                  </pic:blipFill>
-                  <pic:spPr>
-                    <a:xfrm>
-                      <a:off x="0" y="0"/>
-                      <a:ext cx="3200400" cy="6934200"/>
-                    </a:xfrm>
-                    <a:prstGeom prst="rect"/>
-                  </pic:spPr>
-                </pic:pic>
-              </a:graphicData>
-            </a:graphic>
-          </wp:inline>
-        </w:drawing>
+        <w:rPr>
+          <w:rFonts w:ascii="宋体" w:hAnsi="宋体" w:eastAsia="宋体"/>
+          <w:b w:val="0"/>
+          <w:sz w:val="24"/>
+        </w:rPr>
+        <w:t>图 6：待办详情页（已完成状态） ｜ 图 7：删除确认弹窗</w:t>
       </w:r>
     </w:p>
     <w:p>
-      <w:pPr>
-        <w:jc w:val="center"/>
-      </w:pPr>
       <w:r>
-        <w:rPr>
-          <w:i/>
-          <w:sz w:val="20"/>
-        </w:rPr>
-        <w:t>图：待办详情页</w:t>
-      </w:r>
-    </w:p>
-    <w:p>
-      <w:pPr>
-        <w:jc w:val="center"/>
-      </w:pPr>
-      <w:r>
-        <w:drawing>
-          <wp:inline xmlns:a="http://schemas.openxmlformats.org/drawingml/2006/main" xmlns:pic="http://schemas.openxmlformats.org/drawingml/2006/picture">
-            <wp:extent cx="3200400" cy="6934200"/>
-            <wp:docPr id="6" name="Picture 6"/>
-            <wp:cNvGraphicFramePr>
-              <a:graphicFrameLocks noChangeAspect="1"/>
-            </wp:cNvGraphicFramePr>
-            <a:graphic>
-              <a:graphicData uri="http://schemas.openxmlformats.org/drawingml/2006/picture">
-                <pic:pic>
-                  <pic:nvPicPr>
-                    <pic:cNvPr id="0" name="06_status_completed.png"/>
-                    <pic:cNvPicPr/>
-                  </pic:nvPicPr>
-                  <pic:blipFill>
-                    <a:blip r:embed="rId13"/>
-                    <a:stretch>
-                      <a:fillRect/>
-                    </a:stretch>
-                  </pic:blipFill>
-                  <pic:spPr>
-                    <a:xfrm>
-                      <a:off x="0" y="0"/>
-                      <a:ext cx="3200400" cy="6934200"/>
-                    </a:xfrm>
-                    <a:prstGeom prst="rect"/>
-                  </pic:spPr>
-                </pic:pic>
-              </a:graphicData>
-            </a:graphic>
-          </wp:inline>
-        </w:drawing>
-      </w:r>
-    </w:p>
-    <w:p>
-      <w:pPr>
-        <w:jc w:val="center"/>
-      </w:pPr>
-      <w:r>
-        <w:rPr>
-          <w:i/>
-          <w:sz w:val="20"/>
-        </w:rPr>
-        <w:t>图：已完成状态</w:t>
-      </w:r>
-    </w:p>
-    <w:p>
-      <w:pPr>
-        <w:jc w:val="center"/>
-      </w:pPr>
-      <w:r>
-        <w:drawing>
-          <wp:inline xmlns:a="http://schemas.openxmlformats.org/drawingml/2006/main" xmlns:pic="http://schemas.openxmlformats.org/drawingml/2006/picture">
-            <wp:extent cx="3200400" cy="6934200"/>
-            <wp:docPr id="7" name="Picture 7"/>
-            <wp:cNvGraphicFramePr>
-              <a:graphicFrameLocks noChangeAspect="1"/>
-            </wp:cNvGraphicFramePr>
-            <a:graphic>
-              <a:graphicData uri="http://schemas.openxmlformats.org/drawingml/2006/picture">
-                <pic:pic>
-                  <pic:nvPicPr>
-                    <pic:cNvPr id="0" name="07_delete_confirm.png"/>
-                    <pic:cNvPicPr/>
-                  </pic:nvPicPr>
-                  <pic:blipFill>
-                    <a:blip r:embed="rId14"/>
-                    <a:stretch>
-                      <a:fillRect/>
-                    </a:stretch>
-                  </pic:blipFill>
-                  <pic:spPr>
-                    <a:xfrm>
-                      <a:off x="0" y="0"/>
-                      <a:ext cx="3200400" cy="6934200"/>
-                    </a:xfrm>
-                    <a:prstGeom prst="rect"/>
-                  </pic:spPr>
-                </pic:pic>
-              </a:graphicData>
-            </a:graphic>
-          </wp:inline>
-        </w:drawing>
-      </w:r>
-    </w:p>
-    <w:p>
-      <w:pPr>
-        <w:jc w:val="center"/>
-      </w:pPr>
-      <w:r>
-        <w:rPr>
-          <w:i/>
-          <w:sz w:val="20"/>
-        </w:rPr>
-        <w:t>图：删除确认弹窗</w:t>
+        <w:br w:type="page"/>
       </w:r>
     </w:p>
     <w:p>
@@ -1578,7 +1539,7 @@
       </w:pPr>
       <w:r>
         <w:rPr>
-          <w:color w:val="000000"/>
+          <w:color w:val="006B5E"/>
         </w:rPr>
         <w:t>5. 遇到的问题及解决办法</w:t>
       </w:r>
@@ -1589,19 +1550,35 @@
       </w:pPr>
       <w:r>
         <w:rPr>
-          <w:color w:val="000000"/>
+          <w:color w:val="006B5E"/>
         </w:rPr>
-        <w:t>5.1 Toolbar 集成</w:t>
+        <w:t>5.1 Material 3 主题集成</w:t>
       </w:r>
     </w:p>
     <w:p>
+      <w:pPr>
+        <w:spacing w:after="120"/>
+      </w:pPr>
       <w:r>
-        <w:t>问题：使用 NoActionBar 主题导致 onCreateOptionsMenu 无法显示，详情页工具栏编辑按钮不可见。</w:t>
+        <w:rPr>
+          <w:rFonts w:ascii="宋体" w:hAnsi="宋体" w:eastAsia="宋体"/>
+          <w:b w:val="0"/>
+          <w:sz w:val="24"/>
+        </w:rPr>
+        <w:t>问题：使用 Theme.Material3.Light.NoActionBar 主题后，需要自定义顶部渐变条，ActionBar 被完全移除。</w:t>
       </w:r>
     </w:p>
     <w:p>
+      <w:pPr>
+        <w:spacing w:after="120"/>
+      </w:pPr>
       <w:r>
-        <w:t>解决：在 activity_detail.xml 中手动添加 Toolbar 控件，通过 setSupportActionBar(toolbar) 设为 ActionBar，并启用 setDisplayHomeAsUpEnabled(true)。</w:t>
+        <w:rPr>
+          <w:rFonts w:ascii="宋体" w:hAnsi="宋体" w:eastAsia="宋体"/>
+          <w:b w:val="0"/>
+          <w:sz w:val="24"/>
+        </w:rPr>
+        <w:t>解决：在布局中直接使用自定义 View 作为渐变头部，通过 GradientDrawable 实现 #006B5E 到 #009688 的渐变色。各页面统一使用 56~140dp 渐变区域。</w:t>
       </w:r>
     </w:p>
     <w:p>
@@ -1610,19 +1587,72 @@
       </w:pPr>
       <w:r>
         <w:rPr>
-          <w:color w:val="000000"/>
+          <w:color w:val="006B5E"/>
         </w:rPr>
-        <w:t>5.2 RecyclerView 数据刷新</w:t>
+        <w:t>5.2 列表数据刷新</w:t>
       </w:r>
     </w:p>
     <w:p>
+      <w:pPr>
+        <w:spacing w:after="120"/>
+      </w:pPr>
       <w:r>
-        <w:t>问题： Activity 之间跳转返回后，列表需要刷新但无法直接回调。</w:t>
+        <w:rPr>
+          <w:rFonts w:ascii="宋体" w:hAnsi="宋体" w:eastAsia="宋体"/>
+          <w:b w:val="0"/>
+          <w:sz w:val="24"/>
+        </w:rPr>
+        <w:t>问题：Activity 之间跳转返回后，列表需要刷新但无法直接回调。</w:t>
       </w:r>
     </w:p>
     <w:p>
+      <w:pPr>
+        <w:spacing w:after="120"/>
+      </w:pPr>
       <w:r>
+        <w:rPr>
+          <w:rFonts w:ascii="宋体" w:hAnsi="宋体" w:eastAsia="宋体"/>
+          <w:b w:val="0"/>
+          <w:sz w:val="24"/>
+        </w:rPr>
         <w:t>解决：Adapter 实现 swapCursor 方法，MainActivity 在 onResume 中调用 loadTodos 刷新。</w:t>
+      </w:r>
+    </w:p>
+    <w:p>
+      <w:pPr>
+        <w:pStyle w:val="Heading2"/>
+      </w:pPr>
+      <w:r>
+        <w:rPr>
+          <w:color w:val="006B5E"/>
+        </w:rPr>
+        <w:t>5.3 卡片样式统一</w:t>
+      </w:r>
+    </w:p>
+    <w:p>
+      <w:pPr>
+        <w:spacing w:after="120"/>
+      </w:pPr>
+      <w:r>
+        <w:rPr>
+          <w:rFonts w:ascii="宋体" w:hAnsi="宋体" w:eastAsia="宋体"/>
+          <w:b w:val="0"/>
+          <w:sz w:val="24"/>
+        </w:rPr>
+        <w:t>问题：RecyclerView 列表项卡片样式需要统一且美观。</w:t>
+      </w:r>
+    </w:p>
+    <w:p>
+      <w:pPr>
+        <w:spacing w:after="120"/>
+      </w:pPr>
+      <w:r>
+        <w:rPr>
+          <w:rFonts w:ascii="宋体" w:hAnsi="宋体" w:eastAsia="宋体"/>
+          <w:b w:val="0"/>
+          <w:sz w:val="24"/>
+        </w:rPr>
+        <w:t>解决：统一使用 MaterialCardView，14dp 圆角、2dp 阴影，左侧圆形状态指示器区分完成/未完成。</w:t>
       </w:r>
     </w:p>
     <w:p>
@@ -1631,19 +1661,40 @@
       </w:pPr>
       <w:r>
         <w:rPr>
-          <w:color w:val="000000"/>
+          <w:color w:val="006B5E"/>
         </w:rPr>
         <w:t>6. 总结与展望</w:t>
       </w:r>
     </w:p>
     <w:p>
+      <w:pPr>
+        <w:spacing w:after="120"/>
+      </w:pPr>
       <w:r>
-        <w:t>本次课程设计完成了基于安卓的简易待办应用的全部核心功能，包括待办的创建、查看、编辑、删除和状态管理。通过本次实践，掌握了Activity 生命周期、SQLite 数据库操作、RecyclerView 列表展示、Material Design 组件使用等关键技术。</w:t>
+        <w:rPr>
+          <w:rFonts w:ascii="宋体" w:hAnsi="宋体" w:eastAsia="宋体"/>
+          <w:b w:val="0"/>
+          <w:sz w:val="24"/>
+        </w:rPr>
+        <w:t>本次课程设计完成了基于安卓的简易待办应用的全部核心功能，包括待办的创建、查看、编辑、删除和状态管理。通过本次实践，掌握了 Activity 生命周期管理、SQLite 数据库 CRUD 操作、RecyclerView + CardView 列表展示、Material Design 3 主题定制、渐变工具栏实现等技术要点。</w:t>
+      </w:r>
+    </w:p>
+    <w:p>
+      <w:pPr>
+        <w:spacing w:after="120"/>
+      </w:pPr>
+      <w:r>
+        <w:rPr>
+          <w:rFonts w:ascii="宋体" w:hAnsi="宋体" w:eastAsia="宋体"/>
+          <w:b w:val="0"/>
+          <w:sz w:val="24"/>
+        </w:rPr>
+        <w:t>应用整体采用 Material You 设计语言，深松绿主色调搭配暖白背景与圆角卡片，视觉风格现代统一，用户体验流畅。未来可以进一步扩展提醒通知、搜索过滤、数据备份等高级功能。</w:t>
       </w:r>
     </w:p>
     <w:sectPr>
       <w:pgSz w:w="12240" w:h="15840"/>
-      <w:pgMar w:top="1440" w:right="1797" w:bottom="1440" w:left="1797" w:header="720" w:footer="720" w:gutter="0"/>
+      <w:pgMar w:top="1440" w:right="1800" w:bottom="1440" w:left="1800" w:header="720" w:footer="720" w:gutter="0"/>
       <w:cols w:space="720"/>
       <w:docGrid w:linePitch="360"/>
     </w:sectPr>
@@ -2015,7 +2066,7 @@
     <w:qFormat/>
     <w:rsid w:val="00FC693F"/>
     <w:rPr>
-      <w:rFonts w:ascii="宋体" w:hAnsi="宋体"/>
+      <w:rFonts w:ascii="宋体" w:hAnsi="宋体" w:eastAsia="宋体"/>
       <w:sz w:val="24"/>
     </w:rPr>
   </w:style>

</xml_diff>